<commit_message>
Notes sheet: add EAY row to no-dates bond table and say which input each formula needs
Co-Authored-By: Claude Opus 5.5 <noreply@anthropic.com>
Claude-Session: https://claude.ai/code/session_01GEFnz4bwrCJKQo1pbVjL4k
</commit_message>
<xml_diff>
--- a/ec1745-midterm-prep/EC1745_Notes_Sheet.docx
+++ b/ec1745-midterm-prep/EC1745_Notes_Sheet.docx
@@ -4809,7 +4809,7 @@
                 <w:sz w:val="22"/>
                 <w:szCs w:val="22"/>
               </w:rPr>
-              <w:t xml:space="preserve">Yield</w:t>
+              <w:t xml:space="preserve">YTM</w:t>
             </w:r>
           </w:p>
         </w:tc>
@@ -4872,7 +4872,7 @@
                 <w:sz w:val="22"/>
                 <w:szCs w:val="22"/>
               </w:rPr>
-              <w:t xml:space="preserve">Coupon rate</w:t>
+              <w:t xml:space="preserve">EAY</w:t>
             </w:r>
           </w:p>
         </w:tc>
@@ -4902,12 +4902,88 @@
                 <w:sz w:val="22"/>
                 <w:szCs w:val="22"/>
               </w:rPr>
+              <w:t xml:space="preserve">=(1+y/2)^2-1</w:t>
+            </w:r>
+          </w:p>
+        </w:tc>
+      </w:tr>
+      <w:tr>
+        <w:trPr>
+          <w:cantSplit/>
+        </w:trPr>
+        <w:tc>
+          <w:tcPr>
+            <w:tcW w:type="dxa" w:w="1300"/>
+            <w:tcBorders>
+              <w:top w:val="single" w:color="BFBFBF" w:sz="4"/>
+              <w:left w:val="single" w:color="BFBFBF" w:sz="4"/>
+              <w:bottom w:val="single" w:color="BFBFBF" w:sz="4"/>
+              <w:right w:val="single" w:color="BFBFBF" w:sz="4"/>
+            </w:tcBorders>
+            <w:shd w:fill="EEF2F8" w:color="auto" w:val="clear"/>
+            <w:tcMar>
+              <w:top w:type="dxa" w:w="0"/>
+              <w:left w:type="dxa" w:w="50"/>
+              <w:bottom w:type="dxa" w:w="0"/>
+              <w:right w:type="dxa" w:w="50"/>
+            </w:tcMar>
+          </w:tcPr>
+          <w:p>
+            <w:r>
+              <w:rPr>
+                <w:rFonts w:ascii="Calibri" w:cs="Calibri" w:eastAsia="Calibri" w:hAnsi="Calibri"/>
+                <w:sz w:val="22"/>
+                <w:szCs w:val="22"/>
+              </w:rPr>
+              <w:t xml:space="preserve">Coupon rate</w:t>
+            </w:r>
+          </w:p>
+        </w:tc>
+        <w:tc>
+          <w:tcPr>
+            <w:tcW w:type="dxa" w:w="4172"/>
+            <w:tcBorders>
+              <w:top w:val="single" w:color="BFBFBF" w:sz="4"/>
+              <w:left w:val="single" w:color="BFBFBF" w:sz="4"/>
+              <w:bottom w:val="single" w:color="BFBFBF" w:sz="4"/>
+              <w:right w:val="single" w:color="BFBFBF" w:sz="4"/>
+            </w:tcBorders>
+            <w:tcMar>
+              <w:top w:type="dxa" w:w="0"/>
+              <w:left w:type="dxa" w:w="50"/>
+              <w:bottom w:type="dxa" w:w="0"/>
+              <w:right w:type="dxa" w:w="50"/>
+            </w:tcMar>
+          </w:tcPr>
+          <w:p>
+            <w:r>
+              <w:rPr>
+                <w:rFonts w:ascii="Calibri" w:cs="Calibri" w:eastAsia="Calibri" w:hAnsi="Calibri"/>
+                <w:b/>
+                <w:bCs/>
+                <w:color w:val="1F4E79"/>
+                <w:sz w:val="22"/>
+                <w:szCs w:val="22"/>
+              </w:rPr>
               <w:t xml:space="preserve">=2*PMT(y/2,2*years,-price,100)/100</w:t>
             </w:r>
           </w:p>
         </w:tc>
       </w:tr>
     </w:tbl>
+    <w:p>
+      <w:pPr>
+        <w:spacing w:after="0" w:before="0"/>
+      </w:pPr>
+      <w:r>
+        <w:rPr>
+          <w:rFonts w:ascii="Calibri" w:cs="Calibri" w:eastAsia="Calibri" w:hAnsi="Calibri"/>
+          <w:sz w:val="22"/>
+          <w:szCs w:val="22"/>
+        </w:rPr>
+        <w:t xml:space="preserve">Price needs the yield. YTM needs the price (per 100, e.g. 87.91). EAY needs only the YTM. years = years LEFT.</w:t>
+      </w:r>
+    </w:p>
     <w:p>
       <w:pPr>
         <w:spacing w:after="0" w:before="0"/>

</xml_diff>

<commit_message>
Notes sheet: merge user's edits (cash plug, CFO/NWC lines, retention ratio, EV debt, bond names)
Co-Authored-By: Claude Opus 5.5 <noreply@anthropic.com>
Claude-Session: https://claude.ai/code/session_01GEFnz4bwrCJKQo1pbVjL4k
</commit_message>
<xml_diff>
--- a/ec1745-midterm-prep/EC1745_Notes_Sheet.docx
+++ b/ec1745-midterm-prep/EC1745_Notes_Sheet.docx
@@ -207,43 +207,6 @@
           <w:szCs w:val="22"/>
         </w:rPr>
         <w:t xml:space="preserve">. Copy right/down: Ctrl+R / Ctrl+D.</w:t>
-      </w:r>
-    </w:p>
-    <w:p>
-      <w:pPr>
-        <w:pStyle w:val="ListParagraph"/>
-        <w:numPr>
-          <w:ilvl w:val="0"/>
-          <w:numId w:val="2"/>
-        </w:numPr>
-        <w:spacing w:after="0" w:before="0"/>
-      </w:pPr>
-      <w:r>
-        <w:rPr>
-          <w:rFonts w:ascii="Calibri" w:cs="Calibri" w:eastAsia="Calibri" w:hAnsi="Calibri"/>
-          <w:sz w:val="22"/>
-          <w:szCs w:val="22"/>
-        </w:rPr>
-        <w:t xml:space="preserve">Type </w:t>
-      </w:r>
-      <w:r>
-        <w:rPr>
-          <w:rFonts w:ascii="Calibri" w:cs="Calibri" w:eastAsia="Calibri" w:hAnsi="Calibri"/>
-          <w:b/>
-          <w:bCs/>
-          <w:color w:val="1F4E79"/>
-          <w:sz w:val="22"/>
-          <w:szCs w:val="22"/>
-        </w:rPr>
-        <w:t xml:space="preserve">=PV(</w:t>
-      </w:r>
-      <w:r>
-        <w:rPr>
-          <w:rFonts w:ascii="Calibri" w:cs="Calibri" w:eastAsia="Calibri" w:hAnsi="Calibri"/>
-          <w:sz w:val="22"/>
-          <w:szCs w:val="22"/>
-        </w:rPr>
-        <w:t xml:space="preserve"> and Excel shows the inputs in order. Show as %: Home ▸ % button.</w:t>
       </w:r>
     </w:p>
     <w:p>
@@ -2405,6 +2368,24 @@
     </w:p>
     <w:p>
       <w:pPr>
+        <w:pStyle w:val="ListParagraph"/>
+        <w:numPr>
+          <w:ilvl w:val="0"/>
+          <w:numId w:val="2"/>
+        </w:numPr>
+        <w:spacing w:after="0" w:before="0"/>
+      </w:pPr>
+      <w:r>
+        <w:rPr>
+          <w:rFonts w:ascii="Calibri" w:cs="Calibri" w:eastAsia="Calibri" w:hAnsi="Calibri"/>
+          <w:sz w:val="22"/>
+          <w:szCs w:val="22"/>
+        </w:rPr>
+        <w:t xml:space="preserve">New cash balance: subtract AR, inventory and net PP&amp;E from TL + equity.</w:t>
+      </w:r>
+    </w:p>
+    <w:p>
+      <w:pPr>
         <w:keepNext/>
         <w:shd w:fill="1F3864" w:color="auto" w:val="clear"/>
         <w:spacing w:after="10" w:before="50"/>
@@ -2431,33 +2412,33 @@
           <w:sz w:val="22"/>
           <w:szCs w:val="22"/>
         </w:rPr>
-        <w:t xml:space="preserve">Δ (delta) = change = this year – last year. Example: ΔAR = AR 2025 – AR 2024.</w:t>
-      </w:r>
-    </w:p>
-    <w:p>
-      <w:pPr>
-        <w:spacing w:after="0" w:before="0"/>
-      </w:pPr>
-      <w:r>
-        <w:rPr>
-          <w:rFonts w:ascii="Calibri" w:cs="Calibri" w:eastAsia="Calibri" w:hAnsi="Calibri"/>
-          <w:sz w:val="22"/>
-          <w:szCs w:val="22"/>
-        </w:rPr>
-        <w:t xml:space="preserve">Net income</w:t>
-      </w:r>
-    </w:p>
-    <w:p>
-      <w:pPr>
-        <w:spacing w:after="0" w:before="0"/>
-      </w:pPr>
-      <w:r>
-        <w:rPr>
-          <w:rFonts w:ascii="Calibri" w:cs="Calibri" w:eastAsia="Calibri" w:hAnsi="Calibri"/>
-          <w:sz w:val="22"/>
-          <w:szCs w:val="22"/>
-        </w:rPr>
-        <w:t xml:space="preserve">+ Depreciation (an expense, but no cash leaves)</w:t>
+        <w:t xml:space="preserve">Δ = change = this year – last year (ΔAR = AR 2025 – AR 2024).</w:t>
+      </w:r>
+    </w:p>
+    <w:p>
+      <w:pPr>
+        <w:spacing w:after="0" w:before="0"/>
+      </w:pPr>
+      <w:r>
+        <w:rPr>
+          <w:rFonts w:ascii="Calibri" w:cs="Calibri" w:eastAsia="Calibri" w:hAnsi="Calibri"/>
+          <w:sz w:val="22"/>
+          <w:szCs w:val="22"/>
+        </w:rPr>
+        <w:t xml:space="preserve">CFO = Net income + Depreciation – ΔNWC</w:t>
+      </w:r>
+    </w:p>
+    <w:p>
+      <w:pPr>
+        <w:spacing w:after="0" w:before="0"/>
+      </w:pPr>
+      <w:r>
+        <w:rPr>
+          <w:rFonts w:ascii="Calibri" w:cs="Calibri" w:eastAsia="Calibri" w:hAnsi="Calibri"/>
+          <w:sz w:val="22"/>
+          <w:szCs w:val="22"/>
+        </w:rPr>
+        <w:t xml:space="preserve">ΔNWC = ΔAR + ΔI – ΔAP</w:t>
       </w:r>
     </w:p>
     <w:p>
@@ -3176,6 +3157,16 @@
               <w:t xml:space="preserve">ROE × b   (or ROE·b / (1 – ROE·b))</w:t>
             </w:r>
           </w:p>
+          <w:p>
+            <w:r>
+              <w:rPr>
+                <w:rFonts w:ascii="Calibri" w:cs="Calibri" w:eastAsia="Calibri" w:hAnsi="Calibri"/>
+                <w:sz w:val="22"/>
+                <w:szCs w:val="22"/>
+              </w:rPr>
+              <w:t xml:space="preserve">b = retention ratio = retained earnings / net income, or 1 – dividend payout ratio</w:t>
+            </w:r>
+          </w:p>
         </w:tc>
       </w:tr>
       <w:tr>
@@ -3475,7 +3466,7 @@
           <w:sz w:val="22"/>
           <w:szCs w:val="22"/>
         </w:rPr>
-        <w:t xml:space="preserve">Enterprise value (EV) = market cap + debt – excess cash</w:t>
+        <w:t xml:space="preserve">Enterprise value (EV) = market cap + debt (ST + LT) – excess cash</w:t>
       </w:r>
     </w:p>
     <w:p>
@@ -3524,56 +3515,15 @@
     </w:p>
     <w:p>
       <w:pPr>
-        <w:pStyle w:val="ListParagraph"/>
-        <w:numPr>
-          <w:ilvl w:val="0"/>
-          <w:numId w:val="3"/>
-        </w:numPr>
-        <w:spacing w:after="0" w:before="0"/>
-      </w:pPr>
-      <w:r>
-        <w:rPr>
-          <w:rFonts w:ascii="Calibri" w:cs="Calibri" w:eastAsia="Calibri" w:hAnsi="Calibri"/>
-          <w:sz w:val="22"/>
-          <w:szCs w:val="22"/>
-        </w:rPr>
-        <w:t xml:space="preserve">Type the statements in (templates above). Put each ratio in its own labeled cell as a formula pointing at them.</w:t>
-      </w:r>
-    </w:p>
-    <w:p>
-      <w:pPr>
-        <w:pStyle w:val="ListParagraph"/>
-        <w:numPr>
-          <w:ilvl w:val="0"/>
-          <w:numId w:val="3"/>
-        </w:numPr>
-        <w:spacing w:after="0" w:before="0"/>
-      </w:pPr>
-      <w:r>
-        <w:rPr>
-          <w:rFonts w:ascii="Calibri" w:cs="Calibri" w:eastAsia="Calibri" w:hAnsi="Calibri"/>
-          <w:sz w:val="22"/>
-          <w:szCs w:val="22"/>
-        </w:rPr>
-        <w:t xml:space="preserve">Format as % where it is a percent. Check that the DuPont product equals ROE.</w:t>
-      </w:r>
-    </w:p>
-    <w:p>
-      <w:pPr>
-        <w:pStyle w:val="ListParagraph"/>
-        <w:numPr>
-          <w:ilvl w:val="0"/>
-          <w:numId w:val="3"/>
-        </w:numPr>
-        <w:spacing w:after="0" w:before="0"/>
-      </w:pPr>
-      <w:r>
-        <w:rPr>
-          <w:rFonts w:ascii="Calibri" w:cs="Calibri" w:eastAsia="Calibri" w:hAnsi="Calibri"/>
-          <w:sz w:val="22"/>
-          <w:szCs w:val="22"/>
-        </w:rPr>
-        <w:t xml:space="preserve">Asked to interpret? Say which number rose or fell, and why it matters.</w:t>
+        <w:spacing w:after="0" w:before="0"/>
+      </w:pPr>
+      <w:r>
+        <w:rPr>
+          <w:rFonts w:ascii="Calibri" w:cs="Calibri" w:eastAsia="Calibri" w:hAnsi="Calibri"/>
+          <w:sz w:val="22"/>
+          <w:szCs w:val="22"/>
+        </w:rPr>
+        <w:t xml:space="preserve">Type the statements in, then put each ratio in its own labeled cell as a formula. Check DuPont product = ROE. To interpret, say which number moved and why.</w:t>
       </w:r>
     </w:p>
     <w:p>
@@ -4715,8 +4665,8 @@
         </w:tblBorders>
       </w:tblPr>
       <w:tblGrid>
-        <w:gridCol w:w="1300"/>
-        <w:gridCol w:w="4172"/>
+        <w:gridCol w:w="1250"/>
+        <w:gridCol w:w="4222"/>
       </w:tblGrid>
       <w:tr>
         <w:trPr>
@@ -4724,7 +4674,7 @@
         </w:trPr>
         <w:tc>
           <w:tcPr>
-            <w:tcW w:type="dxa" w:w="1300"/>
+            <w:tcW w:type="dxa" w:w="1250"/>
             <w:tcBorders>
               <w:top w:val="single" w:color="BFBFBF" w:sz="4"/>
               <w:left w:val="single" w:color="BFBFBF" w:sz="4"/>
@@ -4752,7 +4702,7 @@
         </w:tc>
         <w:tc>
           <w:tcPr>
-            <w:tcW w:type="dxa" w:w="4172"/>
+            <w:tcW w:type="dxa" w:w="4222"/>
             <w:tcBorders>
               <w:top w:val="single" w:color="BFBFBF" w:sz="4"/>
               <w:left w:val="single" w:color="BFBFBF" w:sz="4"/>
@@ -4776,7 +4726,7 @@
                 <w:sz w:val="22"/>
                 <w:szCs w:val="22"/>
               </w:rPr>
-              <w:t xml:space="preserve">=PV(y/2,2*years,-c*100/2,-100)</w:t>
+              <w:t xml:space="preserve">=PV(yield/2,2*years,-coupon*100/2,-100)</w:t>
             </w:r>
           </w:p>
         </w:tc>
@@ -4787,7 +4737,7 @@
         </w:trPr>
         <w:tc>
           <w:tcPr>
-            <w:tcW w:type="dxa" w:w="1300"/>
+            <w:tcW w:type="dxa" w:w="1250"/>
             <w:tcBorders>
               <w:top w:val="single" w:color="BFBFBF" w:sz="4"/>
               <w:left w:val="single" w:color="BFBFBF" w:sz="4"/>
@@ -4815,7 +4765,7 @@
         </w:tc>
         <w:tc>
           <w:tcPr>
-            <w:tcW w:type="dxa" w:w="4172"/>
+            <w:tcW w:type="dxa" w:w="4222"/>
             <w:tcBorders>
               <w:top w:val="single" w:color="BFBFBF" w:sz="4"/>
               <w:left w:val="single" w:color="BFBFBF" w:sz="4"/>
@@ -4839,7 +4789,7 @@
                 <w:sz w:val="22"/>
                 <w:szCs w:val="22"/>
               </w:rPr>
-              <w:t xml:space="preserve">=2*RATE(2*years,c*100/2,-price,100)</w:t>
+              <w:t xml:space="preserve">=2*RATE(2*years,coupon*100/2,-price,100)</w:t>
             </w:r>
           </w:p>
         </w:tc>
@@ -4850,7 +4800,7 @@
         </w:trPr>
         <w:tc>
           <w:tcPr>
-            <w:tcW w:type="dxa" w:w="1300"/>
+            <w:tcW w:type="dxa" w:w="1250"/>
             <w:tcBorders>
               <w:top w:val="single" w:color="BFBFBF" w:sz="4"/>
               <w:left w:val="single" w:color="BFBFBF" w:sz="4"/>
@@ -4878,7 +4828,7 @@
         </w:tc>
         <w:tc>
           <w:tcPr>
-            <w:tcW w:type="dxa" w:w="4172"/>
+            <w:tcW w:type="dxa" w:w="4222"/>
             <w:tcBorders>
               <w:top w:val="single" w:color="BFBFBF" w:sz="4"/>
               <w:left w:val="single" w:color="BFBFBF" w:sz="4"/>
@@ -4902,7 +4852,7 @@
                 <w:sz w:val="22"/>
                 <w:szCs w:val="22"/>
               </w:rPr>
-              <w:t xml:space="preserve">=(1+y/2)^2-1</w:t>
+              <w:t xml:space="preserve">=(1+yield/2)^2-1</w:t>
             </w:r>
           </w:p>
         </w:tc>
@@ -4913,7 +4863,7 @@
         </w:trPr>
         <w:tc>
           <w:tcPr>
-            <w:tcW w:type="dxa" w:w="1300"/>
+            <w:tcW w:type="dxa" w:w="1250"/>
             <w:tcBorders>
               <w:top w:val="single" w:color="BFBFBF" w:sz="4"/>
               <w:left w:val="single" w:color="BFBFBF" w:sz="4"/>
@@ -4941,7 +4891,7 @@
         </w:tc>
         <w:tc>
           <w:tcPr>
-            <w:tcW w:type="dxa" w:w="4172"/>
+            <w:tcW w:type="dxa" w:w="4222"/>
             <w:tcBorders>
               <w:top w:val="single" w:color="BFBFBF" w:sz="4"/>
               <w:left w:val="single" w:color="BFBFBF" w:sz="4"/>
@@ -4965,7 +4915,7 @@
                 <w:sz w:val="22"/>
                 <w:szCs w:val="22"/>
               </w:rPr>
-              <w:t xml:space="preserve">=2*PMT(y/2,2*years,-price,100)/100</w:t>
+              <w:t xml:space="preserve">=2*PMT(yield/2,2*years,-price,100)/100</w:t>
             </w:r>
           </w:p>
         </w:tc>
@@ -5030,7 +4980,7 @@
         <w:pStyle w:val="ListParagraph"/>
         <w:numPr>
           <w:ilvl w:val="0"/>
-          <w:numId w:val="4"/>
+          <w:numId w:val="3"/>
         </w:numPr>
         <w:spacing w:after="0" w:before="0"/>
       </w:pPr>
@@ -5086,7 +5036,7 @@
         <w:pStyle w:val="ListParagraph"/>
         <w:numPr>
           <w:ilvl w:val="0"/>
-          <w:numId w:val="4"/>
+          <w:numId w:val="3"/>
         </w:numPr>
         <w:spacing w:after="0" w:before="0"/>
       </w:pPr>
@@ -5115,7 +5065,7 @@
         <w:pStyle w:val="ListParagraph"/>
         <w:numPr>
           <w:ilvl w:val="0"/>
-          <w:numId w:val="4"/>
+          <w:numId w:val="3"/>
         </w:numPr>
         <w:spacing w:after="0" w:before="0"/>
       </w:pPr>
@@ -5133,7 +5083,7 @@
         <w:pStyle w:val="ListParagraph"/>
         <w:numPr>
           <w:ilvl w:val="0"/>
-          <w:numId w:val="4"/>
+          <w:numId w:val="3"/>
         </w:numPr>
         <w:spacing w:after="0" w:before="0"/>
       </w:pPr>
@@ -5162,7 +5112,7 @@
         <w:pStyle w:val="ListParagraph"/>
         <w:numPr>
           <w:ilvl w:val="0"/>
-          <w:numId w:val="4"/>
+          <w:numId w:val="3"/>
         </w:numPr>
         <w:spacing w:after="0" w:before="0"/>
       </w:pPr>
@@ -5218,7 +5168,7 @@
         <w:pStyle w:val="ListParagraph"/>
         <w:numPr>
           <w:ilvl w:val="0"/>
-          <w:numId w:val="4"/>
+          <w:numId w:val="3"/>
         </w:numPr>
         <w:spacing w:after="0" w:before="0"/>
       </w:pPr>
@@ -5246,7 +5196,7 @@
         <w:pStyle w:val="ListParagraph"/>
         <w:numPr>
           <w:ilvl w:val="0"/>
-          <w:numId w:val="4"/>
+          <w:numId w:val="3"/>
         </w:numPr>
         <w:spacing w:after="0" w:before="0"/>
       </w:pPr>
@@ -5274,7 +5224,7 @@
         <w:pStyle w:val="ListParagraph"/>
         <w:numPr>
           <w:ilvl w:val="0"/>
-          <w:numId w:val="4"/>
+          <w:numId w:val="3"/>
         </w:numPr>
         <w:spacing w:after="0" w:before="0"/>
       </w:pPr>
@@ -5314,7 +5264,7 @@
         <w:pStyle w:val="ListParagraph"/>
         <w:numPr>
           <w:ilvl w:val="0"/>
-          <w:numId w:val="4"/>
+          <w:numId w:val="3"/>
         </w:numPr>
         <w:spacing w:after="0" w:before="0"/>
       </w:pPr>
@@ -5332,7 +5282,7 @@
         <w:pStyle w:val="ListParagraph"/>
         <w:numPr>
           <w:ilvl w:val="0"/>
-          <w:numId w:val="4"/>
+          <w:numId w:val="3"/>
         </w:numPr>
         <w:spacing w:after="0" w:before="0"/>
       </w:pPr>
@@ -6119,12 +6069,6 @@
     </w:lvlOverride>
   </w:num>
   <w:num w:numId="3">
-    <w:abstractNumId w:val="3"/>
-    <w:lvlOverride w:ilvl="0">
-      <w:startOverride w:val="1"/>
-    </w:lvlOverride>
-  </w:num>
-  <w:num w:numId="4">
     <w:abstractNumId w:val="3"/>
     <w:lvlOverride w:ilvl="0">
       <w:startOverride w:val="1"/>

</xml_diff>

<commit_message>
Notes sheet: restore trimmed lines, set font to 10.5 pt to fit
Co-Authored-By: Claude Opus 5.5 <noreply@anthropic.com>
Claude-Session: https://claude.ai/code/session_01GEFnz4bwrCJKQo1pbVjL4k
</commit_message>
<xml_diff>
--- a/ec1745-midterm-prep/EC1745_Notes_Sheet.docx
+++ b/ec1745-midterm-prep/EC1745_Notes_Sheet.docx
@@ -11,16 +11,16 @@
           <w:rFonts w:ascii="Calibri" w:cs="Calibri" w:eastAsia="Calibri" w:hAnsi="Calibri"/>
           <w:b/>
           <w:bCs/>
-          <w:sz w:val="22"/>
-          <w:szCs w:val="22"/>
+          <w:sz w:val="21"/>
+          <w:szCs w:val="21"/>
         </w:rPr>
         <w:t xml:space="preserve">EC 1745 Midterm Notes</w:t>
       </w:r>
       <w:r>
         <w:rPr>
           <w:rFonts w:ascii="Calibri" w:cs="Calibri" w:eastAsia="Calibri" w:hAnsi="Calibri"/>
-          <w:sz w:val="22"/>
-          <w:szCs w:val="22"/>
+          <w:sz w:val="21"/>
+          <w:szCs w:val="21"/>
         </w:rPr>
         <w:t xml:space="preserve">   Name: ________________</w:t>
       </w:r>
@@ -37,8 +37,8 @@
           <w:b/>
           <w:bCs/>
           <w:color w:val="FFFFFF"/>
-          <w:sz w:val="22"/>
-          <w:szCs w:val="22"/>
+          <w:sz w:val="21"/>
+          <w:szCs w:val="21"/>
         </w:rPr>
         <w:t xml:space="preserve">EXCEL BASICS</w:t>
       </w:r>
@@ -55,8 +55,8 @@
       <w:r>
         <w:rPr>
           <w:rFonts w:ascii="Calibri" w:cs="Calibri" w:eastAsia="Calibri" w:hAnsi="Calibri"/>
-          <w:sz w:val="22"/>
-          <w:szCs w:val="22"/>
+          <w:sz w:val="21"/>
+          <w:szCs w:val="21"/>
         </w:rPr>
         <w:t xml:space="preserve">Every formula starts with </w:t>
       </w:r>
@@ -65,16 +65,16 @@
           <w:rFonts w:ascii="Calibri" w:cs="Calibri" w:eastAsia="Calibri" w:hAnsi="Calibri"/>
           <w:b/>
           <w:bCs/>
-          <w:sz w:val="22"/>
-          <w:szCs w:val="22"/>
+          <w:sz w:val="21"/>
+          <w:szCs w:val="21"/>
         </w:rPr>
         <w:t xml:space="preserve">=</w:t>
       </w:r>
       <w:r>
         <w:rPr>
           <w:rFonts w:ascii="Calibri" w:cs="Calibri" w:eastAsia="Calibri" w:hAnsi="Calibri"/>
-          <w:sz w:val="22"/>
-          <w:szCs w:val="22"/>
+          <w:sz w:val="21"/>
+          <w:szCs w:val="21"/>
         </w:rPr>
         <w:t xml:space="preserve">. Math: + – * / and ^ (power). Example: </w:t>
       </w:r>
@@ -84,16 +84,16 @@
           <w:b/>
           <w:bCs/>
           <w:color w:val="1F4E79"/>
-          <w:sz w:val="22"/>
-          <w:szCs w:val="22"/>
+          <w:sz w:val="21"/>
+          <w:szCs w:val="21"/>
         </w:rPr>
         <w:t xml:space="preserve">=B2-B3</w:t>
       </w:r>
       <w:r>
         <w:rPr>
           <w:rFonts w:ascii="Calibri" w:cs="Calibri" w:eastAsia="Calibri" w:hAnsi="Calibri"/>
-          <w:sz w:val="22"/>
-          <w:szCs w:val="22"/>
+          <w:sz w:val="21"/>
+          <w:szCs w:val="21"/>
         </w:rPr>
         <w:t xml:space="preserve">, </w:t>
       </w:r>
@@ -103,16 +103,16 @@
           <w:b/>
           <w:bCs/>
           <w:color w:val="1F4E79"/>
-          <w:sz w:val="22"/>
-          <w:szCs w:val="22"/>
+          <w:sz w:val="21"/>
+          <w:szCs w:val="21"/>
         </w:rPr>
         <w:t xml:space="preserve">=B5*(1+B6)^2</w:t>
       </w:r>
       <w:r>
         <w:rPr>
           <w:rFonts w:ascii="Calibri" w:cs="Calibri" w:eastAsia="Calibri" w:hAnsi="Calibri"/>
-          <w:sz w:val="22"/>
-          <w:szCs w:val="22"/>
+          <w:sz w:val="21"/>
+          <w:szCs w:val="21"/>
         </w:rPr>
         <w:t xml:space="preserve">.</w:t>
       </w:r>
@@ -129,8 +129,8 @@
       <w:r>
         <w:rPr>
           <w:rFonts w:ascii="Calibri" w:cs="Calibri" w:eastAsia="Calibri" w:hAnsi="Calibri"/>
-          <w:sz w:val="22"/>
-          <w:szCs w:val="22"/>
+          <w:sz w:val="21"/>
+          <w:szCs w:val="21"/>
         </w:rPr>
         <w:t xml:space="preserve">Point at cells instead of retyping numbers. </w:t>
       </w:r>
@@ -139,16 +139,16 @@
           <w:rFonts w:ascii="Calibri" w:cs="Calibri" w:eastAsia="Calibri" w:hAnsi="Calibri"/>
           <w:b/>
           <w:bCs/>
-          <w:sz w:val="22"/>
-          <w:szCs w:val="22"/>
+          <w:sz w:val="21"/>
+          <w:szCs w:val="21"/>
         </w:rPr>
         <w:t xml:space="preserve">$</w:t>
       </w:r>
       <w:r>
         <w:rPr>
           <w:rFonts w:ascii="Calibri" w:cs="Calibri" w:eastAsia="Calibri" w:hAnsi="Calibri"/>
-          <w:sz w:val="22"/>
-          <w:szCs w:val="22"/>
+          <w:sz w:val="21"/>
+          <w:szCs w:val="21"/>
         </w:rPr>
         <w:t xml:space="preserve"> locks a cell when you copy a formula (</w:t>
       </w:r>
@@ -158,16 +158,16 @@
           <w:b/>
           <w:bCs/>
           <w:color w:val="1F4E79"/>
-          <w:sz w:val="22"/>
-          <w:szCs w:val="22"/>
+          <w:sz w:val="21"/>
+          <w:szCs w:val="21"/>
         </w:rPr>
         <w:t xml:space="preserve">=B2/$B$20</w:t>
       </w:r>
       <w:r>
         <w:rPr>
           <w:rFonts w:ascii="Calibri" w:cs="Calibri" w:eastAsia="Calibri" w:hAnsi="Calibri"/>
-          <w:sz w:val="22"/>
-          <w:szCs w:val="22"/>
+          <w:sz w:val="21"/>
+          <w:szCs w:val="21"/>
         </w:rPr>
         <w:t xml:space="preserve">); press F4 to add it.</w:t>
       </w:r>
@@ -184,8 +184,8 @@
       <w:r>
         <w:rPr>
           <w:rFonts w:ascii="Calibri" w:cs="Calibri" w:eastAsia="Calibri" w:hAnsi="Calibri"/>
-          <w:sz w:val="22"/>
-          <w:szCs w:val="22"/>
+          <w:sz w:val="21"/>
+          <w:szCs w:val="21"/>
         </w:rPr>
         <w:t xml:space="preserve">Rates as decimals: 5% = 0.05; 100 bp = 0.01. Dates: </w:t>
       </w:r>
@@ -195,18 +195,55 @@
           <w:b/>
           <w:bCs/>
           <w:color w:val="1F4E79"/>
-          <w:sz w:val="22"/>
-          <w:szCs w:val="22"/>
+          <w:sz w:val="21"/>
+          <w:szCs w:val="21"/>
         </w:rPr>
         <w:t xml:space="preserve">=DATE(2025,10,7)</w:t>
       </w:r>
       <w:r>
         <w:rPr>
           <w:rFonts w:ascii="Calibri" w:cs="Calibri" w:eastAsia="Calibri" w:hAnsi="Calibri"/>
-          <w:sz w:val="22"/>
-          <w:szCs w:val="22"/>
+          <w:sz w:val="21"/>
+          <w:szCs w:val="21"/>
         </w:rPr>
         <w:t xml:space="preserve">. Copy right/down: Ctrl+R / Ctrl+D.</w:t>
+      </w:r>
+    </w:p>
+    <w:p>
+      <w:pPr>
+        <w:pStyle w:val="ListParagraph"/>
+        <w:numPr>
+          <w:ilvl w:val="0"/>
+          <w:numId w:val="2"/>
+        </w:numPr>
+        <w:spacing w:after="0" w:before="0"/>
+      </w:pPr>
+      <w:r>
+        <w:rPr>
+          <w:rFonts w:ascii="Calibri" w:cs="Calibri" w:eastAsia="Calibri" w:hAnsi="Calibri"/>
+          <w:sz w:val="21"/>
+          <w:szCs w:val="21"/>
+        </w:rPr>
+        <w:t xml:space="preserve">Type </w:t>
+      </w:r>
+      <w:r>
+        <w:rPr>
+          <w:rFonts w:ascii="Calibri" w:cs="Calibri" w:eastAsia="Calibri" w:hAnsi="Calibri"/>
+          <w:b/>
+          <w:bCs/>
+          <w:color w:val="1F4E79"/>
+          <w:sz w:val="21"/>
+          <w:szCs w:val="21"/>
+        </w:rPr>
+        <w:t xml:space="preserve">=PV(</w:t>
+      </w:r>
+      <w:r>
+        <w:rPr>
+          <w:rFonts w:ascii="Calibri" w:cs="Calibri" w:eastAsia="Calibri" w:hAnsi="Calibri"/>
+          <w:sz w:val="21"/>
+          <w:szCs w:val="21"/>
+        </w:rPr>
+        <w:t xml:space="preserve"> and Excel shows the inputs in order. Show as %: Home ▸ % button.</w:t>
       </w:r>
     </w:p>
     <w:p>
@@ -221,8 +258,8 @@
           <w:b/>
           <w:bCs/>
           <w:color w:val="FFFFFF"/>
-          <w:sz w:val="22"/>
-          <w:szCs w:val="22"/>
+          <w:sz w:val="21"/>
+          <w:szCs w:val="21"/>
         </w:rPr>
         <w:t xml:space="preserve">INCOME STATEMENT (top line → bottom line)</w:t>
       </w:r>
@@ -234,8 +271,8 @@
       <w:r>
         <w:rPr>
           <w:rFonts w:ascii="Calibri" w:cs="Calibri" w:eastAsia="Calibri" w:hAnsi="Calibri"/>
-          <w:sz w:val="22"/>
-          <w:szCs w:val="22"/>
+          <w:sz w:val="21"/>
+          <w:szCs w:val="21"/>
         </w:rPr>
         <w:t xml:space="preserve">Labels in column A, one year per column (B = 2024, C = 2023). “type” = number given in the question.</w:t>
       </w:r>
@@ -284,8 +321,8 @@
                 <w:rFonts w:ascii="Calibri" w:cs="Calibri" w:eastAsia="Calibri" w:hAnsi="Calibri"/>
                 <w:b/>
                 <w:bCs/>
-                <w:sz w:val="22"/>
-                <w:szCs w:val="22"/>
+                <w:sz w:val="21"/>
+                <w:szCs w:val="21"/>
               </w:rPr>
               <w:t xml:space="preserve">#</w:t>
             </w:r>
@@ -314,8 +351,8 @@
                 <w:rFonts w:ascii="Calibri" w:cs="Calibri" w:eastAsia="Calibri" w:hAnsi="Calibri"/>
                 <w:b/>
                 <w:bCs/>
-                <w:sz w:val="22"/>
-                <w:szCs w:val="22"/>
+                <w:sz w:val="21"/>
+                <w:szCs w:val="21"/>
               </w:rPr>
               <w:t xml:space="preserve">Column A (label)</w:t>
             </w:r>
@@ -344,8 +381,8 @@
                 <w:rFonts w:ascii="Calibri" w:cs="Calibri" w:eastAsia="Calibri" w:hAnsi="Calibri"/>
                 <w:b/>
                 <w:bCs/>
-                <w:sz w:val="22"/>
-                <w:szCs w:val="22"/>
+                <w:sz w:val="21"/>
+                <w:szCs w:val="21"/>
               </w:rPr>
               <w:t xml:space="preserve">Column B</w:t>
             </w:r>
@@ -377,8 +414,8 @@
             <w:r>
               <w:rPr>
                 <w:rFonts w:ascii="Calibri" w:cs="Calibri" w:eastAsia="Calibri" w:hAnsi="Calibri"/>
-                <w:sz w:val="22"/>
-                <w:szCs w:val="22"/>
+                <w:sz w:val="21"/>
+                <w:szCs w:val="21"/>
               </w:rPr>
               <w:t xml:space="preserve">1</w:t>
             </w:r>
@@ -404,8 +441,8 @@
             <w:r>
               <w:rPr>
                 <w:rFonts w:ascii="Calibri" w:cs="Calibri" w:eastAsia="Calibri" w:hAnsi="Calibri"/>
-                <w:sz w:val="22"/>
-                <w:szCs w:val="22"/>
+                <w:sz w:val="21"/>
+                <w:szCs w:val="21"/>
               </w:rPr>
               <w:t xml:space="preserve">Year →</w:t>
             </w:r>
@@ -431,8 +468,8 @@
             <w:r>
               <w:rPr>
                 <w:rFonts w:ascii="Calibri" w:cs="Calibri" w:eastAsia="Calibri" w:hAnsi="Calibri"/>
-                <w:sz w:val="22"/>
-                <w:szCs w:val="22"/>
+                <w:sz w:val="21"/>
+                <w:szCs w:val="21"/>
               </w:rPr>
               <w:t xml:space="preserve">2024</w:t>
             </w:r>
@@ -464,8 +501,8 @@
             <w:r>
               <w:rPr>
                 <w:rFonts w:ascii="Calibri" w:cs="Calibri" w:eastAsia="Calibri" w:hAnsi="Calibri"/>
-                <w:sz w:val="22"/>
-                <w:szCs w:val="22"/>
+                <w:sz w:val="21"/>
+                <w:szCs w:val="21"/>
               </w:rPr>
               <w:t xml:space="preserve">2</w:t>
             </w:r>
@@ -493,16 +530,16 @@
                 <w:rFonts w:ascii="Calibri" w:cs="Calibri" w:eastAsia="Calibri" w:hAnsi="Calibri"/>
                 <w:b/>
                 <w:bCs/>
-                <w:sz w:val="22"/>
-                <w:szCs w:val="22"/>
+                <w:sz w:val="21"/>
+                <w:szCs w:val="21"/>
               </w:rPr>
               <w:t xml:space="preserve">Revenue (sales)</w:t>
             </w:r>
             <w:r>
               <w:rPr>
                 <w:rFonts w:ascii="Calibri" w:cs="Calibri" w:eastAsia="Calibri" w:hAnsi="Calibri"/>
-                <w:sz w:val="22"/>
-                <w:szCs w:val="22"/>
+                <w:sz w:val="21"/>
+                <w:szCs w:val="21"/>
               </w:rPr>
               <w:t xml:space="preserve"> ← TOP LINE</w:t>
             </w:r>
@@ -528,8 +565,8 @@
             <w:r>
               <w:rPr>
                 <w:rFonts w:ascii="Calibri" w:cs="Calibri" w:eastAsia="Calibri" w:hAnsi="Calibri"/>
-                <w:sz w:val="22"/>
-                <w:szCs w:val="22"/>
+                <w:sz w:val="21"/>
+                <w:szCs w:val="21"/>
               </w:rPr>
               <w:t xml:space="preserve">type</w:t>
             </w:r>
@@ -561,8 +598,8 @@
             <w:r>
               <w:rPr>
                 <w:rFonts w:ascii="Calibri" w:cs="Calibri" w:eastAsia="Calibri" w:hAnsi="Calibri"/>
-                <w:sz w:val="22"/>
-                <w:szCs w:val="22"/>
+                <w:sz w:val="21"/>
+                <w:szCs w:val="21"/>
               </w:rPr>
               <w:t xml:space="preserve">3</w:t>
             </w:r>
@@ -588,8 +625,8 @@
             <w:r>
               <w:rPr>
                 <w:rFonts w:ascii="Calibri" w:cs="Calibri" w:eastAsia="Calibri" w:hAnsi="Calibri"/>
-                <w:sz w:val="22"/>
-                <w:szCs w:val="22"/>
+                <w:sz w:val="21"/>
+                <w:szCs w:val="21"/>
               </w:rPr>
               <w:t xml:space="preserve">– Cost of goods sold (COGS)</w:t>
             </w:r>
@@ -615,8 +652,8 @@
             <w:r>
               <w:rPr>
                 <w:rFonts w:ascii="Calibri" w:cs="Calibri" w:eastAsia="Calibri" w:hAnsi="Calibri"/>
-                <w:sz w:val="22"/>
-                <w:szCs w:val="22"/>
+                <w:sz w:val="21"/>
+                <w:szCs w:val="21"/>
               </w:rPr>
               <w:t xml:space="preserve">type</w:t>
             </w:r>
@@ -648,8 +685,8 @@
             <w:r>
               <w:rPr>
                 <w:rFonts w:ascii="Calibri" w:cs="Calibri" w:eastAsia="Calibri" w:hAnsi="Calibri"/>
-                <w:sz w:val="22"/>
-                <w:szCs w:val="22"/>
+                <w:sz w:val="21"/>
+                <w:szCs w:val="21"/>
               </w:rPr>
               <w:t xml:space="preserve">4</w:t>
             </w:r>
@@ -677,8 +714,8 @@
                 <w:rFonts w:ascii="Calibri" w:cs="Calibri" w:eastAsia="Calibri" w:hAnsi="Calibri"/>
                 <w:b/>
                 <w:bCs/>
-                <w:sz w:val="22"/>
-                <w:szCs w:val="22"/>
+                <w:sz w:val="21"/>
+                <w:szCs w:val="21"/>
               </w:rPr>
               <w:t xml:space="preserve">= Gross profit</w:t>
             </w:r>
@@ -707,8 +744,8 @@
                 <w:b/>
                 <w:bCs/>
                 <w:color w:val="1F4E79"/>
-                <w:sz w:val="22"/>
-                <w:szCs w:val="22"/>
+                <w:sz w:val="21"/>
+                <w:szCs w:val="21"/>
               </w:rPr>
               <w:t xml:space="preserve">=B2-B3</w:t>
             </w:r>
@@ -740,8 +777,8 @@
             <w:r>
               <w:rPr>
                 <w:rFonts w:ascii="Calibri" w:cs="Calibri" w:eastAsia="Calibri" w:hAnsi="Calibri"/>
-                <w:sz w:val="22"/>
-                <w:szCs w:val="22"/>
+                <w:sz w:val="21"/>
+                <w:szCs w:val="21"/>
               </w:rPr>
               <w:t xml:space="preserve">5</w:t>
             </w:r>
@@ -767,8 +804,8 @@
             <w:r>
               <w:rPr>
                 <w:rFonts w:ascii="Calibri" w:cs="Calibri" w:eastAsia="Calibri" w:hAnsi="Calibri"/>
-                <w:sz w:val="22"/>
-                <w:szCs w:val="22"/>
+                <w:sz w:val="21"/>
+                <w:szCs w:val="21"/>
               </w:rPr>
               <w:t xml:space="preserve">– SG&amp;A (operating costs)</w:t>
             </w:r>
@@ -794,8 +831,8 @@
             <w:r>
               <w:rPr>
                 <w:rFonts w:ascii="Calibri" w:cs="Calibri" w:eastAsia="Calibri" w:hAnsi="Calibri"/>
-                <w:sz w:val="22"/>
-                <w:szCs w:val="22"/>
+                <w:sz w:val="21"/>
+                <w:szCs w:val="21"/>
               </w:rPr>
               <w:t xml:space="preserve">type</w:t>
             </w:r>
@@ -827,8 +864,8 @@
             <w:r>
               <w:rPr>
                 <w:rFonts w:ascii="Calibri" w:cs="Calibri" w:eastAsia="Calibri" w:hAnsi="Calibri"/>
-                <w:sz w:val="22"/>
-                <w:szCs w:val="22"/>
+                <w:sz w:val="21"/>
+                <w:szCs w:val="21"/>
               </w:rPr>
               <w:t xml:space="preserve">6</w:t>
             </w:r>
@@ -856,8 +893,8 @@
                 <w:rFonts w:ascii="Calibri" w:cs="Calibri" w:eastAsia="Calibri" w:hAnsi="Calibri"/>
                 <w:b/>
                 <w:bCs/>
-                <w:sz w:val="22"/>
-                <w:szCs w:val="22"/>
+                <w:sz w:val="21"/>
+                <w:szCs w:val="21"/>
               </w:rPr>
               <w:t xml:space="preserve">= EBITDA</w:t>
             </w:r>
@@ -886,8 +923,8 @@
                 <w:b/>
                 <w:bCs/>
                 <w:color w:val="1F4E79"/>
-                <w:sz w:val="22"/>
-                <w:szCs w:val="22"/>
+                <w:sz w:val="21"/>
+                <w:szCs w:val="21"/>
               </w:rPr>
               <w:t xml:space="preserve">=B4-B5</w:t>
             </w:r>
@@ -919,8 +956,8 @@
             <w:r>
               <w:rPr>
                 <w:rFonts w:ascii="Calibri" w:cs="Calibri" w:eastAsia="Calibri" w:hAnsi="Calibri"/>
-                <w:sz w:val="22"/>
-                <w:szCs w:val="22"/>
+                <w:sz w:val="21"/>
+                <w:szCs w:val="21"/>
               </w:rPr>
               <w:t xml:space="preserve">7</w:t>
             </w:r>
@@ -946,8 +983,8 @@
             <w:r>
               <w:rPr>
                 <w:rFonts w:ascii="Calibri" w:cs="Calibri" w:eastAsia="Calibri" w:hAnsi="Calibri"/>
-                <w:sz w:val="22"/>
-                <w:szCs w:val="22"/>
+                <w:sz w:val="21"/>
+                <w:szCs w:val="21"/>
               </w:rPr>
               <w:t xml:space="preserve">– Depreciation &amp; amortization</w:t>
             </w:r>
@@ -973,8 +1010,8 @@
             <w:r>
               <w:rPr>
                 <w:rFonts w:ascii="Calibri" w:cs="Calibri" w:eastAsia="Calibri" w:hAnsi="Calibri"/>
-                <w:sz w:val="22"/>
-                <w:szCs w:val="22"/>
+                <w:sz w:val="21"/>
+                <w:szCs w:val="21"/>
               </w:rPr>
               <w:t xml:space="preserve">type</w:t>
             </w:r>
@@ -1006,8 +1043,8 @@
             <w:r>
               <w:rPr>
                 <w:rFonts w:ascii="Calibri" w:cs="Calibri" w:eastAsia="Calibri" w:hAnsi="Calibri"/>
-                <w:sz w:val="22"/>
-                <w:szCs w:val="22"/>
+                <w:sz w:val="21"/>
+                <w:szCs w:val="21"/>
               </w:rPr>
               <w:t xml:space="preserve">8</w:t>
             </w:r>
@@ -1035,16 +1072,16 @@
                 <w:rFonts w:ascii="Calibri" w:cs="Calibri" w:eastAsia="Calibri" w:hAnsi="Calibri"/>
                 <w:b/>
                 <w:bCs/>
-                <w:sz w:val="22"/>
-                <w:szCs w:val="22"/>
+                <w:sz w:val="21"/>
+                <w:szCs w:val="21"/>
               </w:rPr>
               <w:t xml:space="preserve">= EBIT</w:t>
             </w:r>
             <w:r>
               <w:rPr>
                 <w:rFonts w:ascii="Calibri" w:cs="Calibri" w:eastAsia="Calibri" w:hAnsi="Calibri"/>
-                <w:sz w:val="22"/>
-                <w:szCs w:val="22"/>
+                <w:sz w:val="21"/>
+                <w:szCs w:val="21"/>
               </w:rPr>
               <w:t xml:space="preserve"> (operating income)</w:t>
             </w:r>
@@ -1073,8 +1110,8 @@
                 <w:b/>
                 <w:bCs/>
                 <w:color w:val="1F4E79"/>
-                <w:sz w:val="22"/>
-                <w:szCs w:val="22"/>
+                <w:sz w:val="21"/>
+                <w:szCs w:val="21"/>
               </w:rPr>
               <w:t xml:space="preserve">=B6-B7</w:t>
             </w:r>
@@ -1106,8 +1143,8 @@
             <w:r>
               <w:rPr>
                 <w:rFonts w:ascii="Calibri" w:cs="Calibri" w:eastAsia="Calibri" w:hAnsi="Calibri"/>
-                <w:sz w:val="22"/>
-                <w:szCs w:val="22"/>
+                <w:sz w:val="21"/>
+                <w:szCs w:val="21"/>
               </w:rPr>
               <w:t xml:space="preserve">9</w:t>
             </w:r>
@@ -1133,8 +1170,8 @@
             <w:r>
               <w:rPr>
                 <w:rFonts w:ascii="Calibri" w:cs="Calibri" w:eastAsia="Calibri" w:hAnsi="Calibri"/>
-                <w:sz w:val="22"/>
-                <w:szCs w:val="22"/>
+                <w:sz w:val="21"/>
+                <w:szCs w:val="21"/>
               </w:rPr>
               <w:t xml:space="preserve">– Interest expense</w:t>
             </w:r>
@@ -1160,8 +1197,8 @@
             <w:r>
               <w:rPr>
                 <w:rFonts w:ascii="Calibri" w:cs="Calibri" w:eastAsia="Calibri" w:hAnsi="Calibri"/>
-                <w:sz w:val="22"/>
-                <w:szCs w:val="22"/>
+                <w:sz w:val="21"/>
+                <w:szCs w:val="21"/>
               </w:rPr>
               <w:t xml:space="preserve">type</w:t>
             </w:r>
@@ -1193,8 +1230,8 @@
             <w:r>
               <w:rPr>
                 <w:rFonts w:ascii="Calibri" w:cs="Calibri" w:eastAsia="Calibri" w:hAnsi="Calibri"/>
-                <w:sz w:val="22"/>
-                <w:szCs w:val="22"/>
+                <w:sz w:val="21"/>
+                <w:szCs w:val="21"/>
               </w:rPr>
               <w:t xml:space="preserve">10</w:t>
             </w:r>
@@ -1222,16 +1259,16 @@
                 <w:rFonts w:ascii="Calibri" w:cs="Calibri" w:eastAsia="Calibri" w:hAnsi="Calibri"/>
                 <w:b/>
                 <w:bCs/>
-                <w:sz w:val="22"/>
-                <w:szCs w:val="22"/>
+                <w:sz w:val="21"/>
+                <w:szCs w:val="21"/>
               </w:rPr>
               <w:t xml:space="preserve">= Pretax income</w:t>
             </w:r>
             <w:r>
               <w:rPr>
                 <w:rFonts w:ascii="Calibri" w:cs="Calibri" w:eastAsia="Calibri" w:hAnsi="Calibri"/>
-                <w:sz w:val="22"/>
-                <w:szCs w:val="22"/>
+                <w:sz w:val="21"/>
+                <w:szCs w:val="21"/>
               </w:rPr>
               <w:t xml:space="preserve"> (EBT)</w:t>
             </w:r>
@@ -1260,8 +1297,8 @@
                 <w:b/>
                 <w:bCs/>
                 <w:color w:val="1F4E79"/>
-                <w:sz w:val="22"/>
-                <w:szCs w:val="22"/>
+                <w:sz w:val="21"/>
+                <w:szCs w:val="21"/>
               </w:rPr>
               <w:t xml:space="preserve">=B8-B9</w:t>
             </w:r>
@@ -1293,8 +1330,8 @@
             <w:r>
               <w:rPr>
                 <w:rFonts w:ascii="Calibri" w:cs="Calibri" w:eastAsia="Calibri" w:hAnsi="Calibri"/>
-                <w:sz w:val="22"/>
-                <w:szCs w:val="22"/>
+                <w:sz w:val="21"/>
+                <w:szCs w:val="21"/>
               </w:rPr>
               <w:t xml:space="preserve">11</w:t>
             </w:r>
@@ -1320,8 +1357,8 @@
             <w:r>
               <w:rPr>
                 <w:rFonts w:ascii="Calibri" w:cs="Calibri" w:eastAsia="Calibri" w:hAnsi="Calibri"/>
-                <w:sz w:val="22"/>
-                <w:szCs w:val="22"/>
+                <w:sz w:val="21"/>
+                <w:szCs w:val="21"/>
               </w:rPr>
               <w:t xml:space="preserve">– Taxes (tax rate × EBT)</w:t>
             </w:r>
@@ -1350,8 +1387,8 @@
                 <w:b/>
                 <w:bCs/>
                 <w:color w:val="1F4E79"/>
-                <w:sz w:val="22"/>
-                <w:szCs w:val="22"/>
+                <w:sz w:val="21"/>
+                <w:szCs w:val="21"/>
               </w:rPr>
               <w:t xml:space="preserve">=0.21*B10</w:t>
             </w:r>
@@ -1383,8 +1420,8 @@
             <w:r>
               <w:rPr>
                 <w:rFonts w:ascii="Calibri" w:cs="Calibri" w:eastAsia="Calibri" w:hAnsi="Calibri"/>
-                <w:sz w:val="22"/>
-                <w:szCs w:val="22"/>
+                <w:sz w:val="21"/>
+                <w:szCs w:val="21"/>
               </w:rPr>
               <w:t xml:space="preserve">12</w:t>
             </w:r>
@@ -1412,16 +1449,16 @@
                 <w:rFonts w:ascii="Calibri" w:cs="Calibri" w:eastAsia="Calibri" w:hAnsi="Calibri"/>
                 <w:b/>
                 <w:bCs/>
-                <w:sz w:val="22"/>
-                <w:szCs w:val="22"/>
+                <w:sz w:val="21"/>
+                <w:szCs w:val="21"/>
               </w:rPr>
               <w:t xml:space="preserve">= Net income</w:t>
             </w:r>
             <w:r>
               <w:rPr>
                 <w:rFonts w:ascii="Calibri" w:cs="Calibri" w:eastAsia="Calibri" w:hAnsi="Calibri"/>
-                <w:sz w:val="22"/>
-                <w:szCs w:val="22"/>
+                <w:sz w:val="21"/>
+                <w:szCs w:val="21"/>
               </w:rPr>
               <w:t xml:space="preserve"> ← BOTTOM LINE</w:t>
             </w:r>
@@ -1450,8 +1487,8 @@
                 <w:b/>
                 <w:bCs/>
                 <w:color w:val="1F4E79"/>
-                <w:sz w:val="22"/>
-                <w:szCs w:val="22"/>
+                <w:sz w:val="21"/>
+                <w:szCs w:val="21"/>
               </w:rPr>
               <w:t xml:space="preserve">=B10-B11</w:t>
             </w:r>
@@ -1483,8 +1520,8 @@
             <w:r>
               <w:rPr>
                 <w:rFonts w:ascii="Calibri" w:cs="Calibri" w:eastAsia="Calibri" w:hAnsi="Calibri"/>
-                <w:sz w:val="22"/>
-                <w:szCs w:val="22"/>
+                <w:sz w:val="21"/>
+                <w:szCs w:val="21"/>
               </w:rPr>
               <w:t xml:space="preserve">13</w:t>
             </w:r>
@@ -1510,8 +1547,8 @@
             <w:r>
               <w:rPr>
                 <w:rFonts w:ascii="Calibri" w:cs="Calibri" w:eastAsia="Calibri" w:hAnsi="Calibri"/>
-                <w:sz w:val="22"/>
-                <w:szCs w:val="22"/>
+                <w:sz w:val="21"/>
+                <w:szCs w:val="21"/>
               </w:rPr>
               <w:t xml:space="preserve">– Dividends</w:t>
             </w:r>
@@ -1537,8 +1574,8 @@
             <w:r>
               <w:rPr>
                 <w:rFonts w:ascii="Calibri" w:cs="Calibri" w:eastAsia="Calibri" w:hAnsi="Calibri"/>
-                <w:sz w:val="22"/>
-                <w:szCs w:val="22"/>
+                <w:sz w:val="21"/>
+                <w:szCs w:val="21"/>
               </w:rPr>
               <w:t xml:space="preserve">type</w:t>
             </w:r>
@@ -1570,8 +1607,8 @@
             <w:r>
               <w:rPr>
                 <w:rFonts w:ascii="Calibri" w:cs="Calibri" w:eastAsia="Calibri" w:hAnsi="Calibri"/>
-                <w:sz w:val="22"/>
-                <w:szCs w:val="22"/>
+                <w:sz w:val="21"/>
+                <w:szCs w:val="21"/>
               </w:rPr>
               <w:t xml:space="preserve">14</w:t>
             </w:r>
@@ -1599,16 +1636,16 @@
                 <w:rFonts w:ascii="Calibri" w:cs="Calibri" w:eastAsia="Calibri" w:hAnsi="Calibri"/>
                 <w:b/>
                 <w:bCs/>
-                <w:sz w:val="22"/>
-                <w:szCs w:val="22"/>
+                <w:sz w:val="21"/>
+                <w:szCs w:val="21"/>
               </w:rPr>
               <w:t xml:space="preserve">= Retained earnings</w:t>
             </w:r>
             <w:r>
               <w:rPr>
                 <w:rFonts w:ascii="Calibri" w:cs="Calibri" w:eastAsia="Calibri" w:hAnsi="Calibri"/>
-                <w:sz w:val="22"/>
-                <w:szCs w:val="22"/>
+                <w:sz w:val="21"/>
+                <w:szCs w:val="21"/>
               </w:rPr>
               <w:t xml:space="preserve"> (kept)</w:t>
             </w:r>
@@ -1637,8 +1674,8 @@
                 <w:b/>
                 <w:bCs/>
                 <w:color w:val="1F4E79"/>
-                <w:sz w:val="22"/>
-                <w:szCs w:val="22"/>
+                <w:sz w:val="21"/>
+                <w:szCs w:val="21"/>
               </w:rPr>
               <w:t xml:space="preserve">=B12-B13</w:t>
             </w:r>
@@ -1653,8 +1690,8 @@
       <w:r>
         <w:rPr>
           <w:rFonts w:ascii="Calibri" w:cs="Calibri" w:eastAsia="Calibri" w:hAnsi="Calibri"/>
-          <w:sz w:val="22"/>
-          <w:szCs w:val="22"/>
+          <w:sz w:val="21"/>
+          <w:szCs w:val="21"/>
         </w:rPr>
         <w:t xml:space="preserve">EPS = NI / shares. Retention ratio </w:t>
       </w:r>
@@ -1663,16 +1700,16 @@
           <w:rFonts w:ascii="Calibri" w:cs="Calibri" w:eastAsia="Calibri" w:hAnsi="Calibri"/>
           <w:b/>
           <w:bCs/>
-          <w:sz w:val="22"/>
-          <w:szCs w:val="22"/>
+          <w:sz w:val="21"/>
+          <w:szCs w:val="21"/>
         </w:rPr>
         <w:t xml:space="preserve">b</w:t>
       </w:r>
       <w:r>
         <w:rPr>
           <w:rFonts w:ascii="Calibri" w:cs="Calibri" w:eastAsia="Calibri" w:hAnsi="Calibri"/>
-          <w:sz w:val="22"/>
-          <w:szCs w:val="22"/>
+          <w:sz w:val="21"/>
+          <w:szCs w:val="21"/>
         </w:rPr>
         <w:t xml:space="preserve"> = (NI – dividends) / NI.</w:t>
       </w:r>
@@ -1689,8 +1726,8 @@
           <w:b/>
           <w:bCs/>
           <w:color w:val="FFFFFF"/>
-          <w:sz w:val="22"/>
-          <w:szCs w:val="22"/>
+          <w:sz w:val="21"/>
+          <w:szCs w:val="21"/>
         </w:rPr>
         <w:t xml:space="preserve">BALANCE SHEET (snapshot on one date)</w:t>
       </w:r>
@@ -1738,8 +1775,8 @@
                 <w:rFonts w:ascii="Calibri" w:cs="Calibri" w:eastAsia="Calibri" w:hAnsi="Calibri"/>
                 <w:b/>
                 <w:bCs/>
-                <w:sz w:val="22"/>
-                <w:szCs w:val="22"/>
+                <w:sz w:val="21"/>
+                <w:szCs w:val="21"/>
               </w:rPr>
               <w:t xml:space="preserve">ASSETS</w:t>
             </w:r>
@@ -1768,8 +1805,8 @@
                 <w:rFonts w:ascii="Calibri" w:cs="Calibri" w:eastAsia="Calibri" w:hAnsi="Calibri"/>
                 <w:b/>
                 <w:bCs/>
-                <w:sz w:val="22"/>
-                <w:szCs w:val="22"/>
+                <w:sz w:val="21"/>
+                <w:szCs w:val="21"/>
               </w:rPr>
               <w:t xml:space="preserve">LIABILITIES &amp; EQUITY</w:t>
             </w:r>
@@ -1800,8 +1837,8 @@
             <w:r>
               <w:rPr>
                 <w:rFonts w:ascii="Calibri" w:cs="Calibri" w:eastAsia="Calibri" w:hAnsi="Calibri"/>
-                <w:sz w:val="22"/>
-                <w:szCs w:val="22"/>
+                <w:sz w:val="21"/>
+                <w:szCs w:val="21"/>
               </w:rPr>
               <w:t xml:space="preserve">Cash</w:t>
             </w:r>
@@ -1827,8 +1864,8 @@
             <w:r>
               <w:rPr>
                 <w:rFonts w:ascii="Calibri" w:cs="Calibri" w:eastAsia="Calibri" w:hAnsi="Calibri"/>
-                <w:sz w:val="22"/>
-                <w:szCs w:val="22"/>
+                <w:sz w:val="21"/>
+                <w:szCs w:val="21"/>
               </w:rPr>
               <w:t xml:space="preserve">Accounts payable (AP)</w:t>
             </w:r>
@@ -1859,8 +1896,8 @@
             <w:r>
               <w:rPr>
                 <w:rFonts w:ascii="Calibri" w:cs="Calibri" w:eastAsia="Calibri" w:hAnsi="Calibri"/>
-                <w:sz w:val="22"/>
-                <w:szCs w:val="22"/>
+                <w:sz w:val="21"/>
+                <w:szCs w:val="21"/>
               </w:rPr>
               <w:t xml:space="preserve">+ Accounts receivable (AR)</w:t>
             </w:r>
@@ -1886,8 +1923,8 @@
             <w:r>
               <w:rPr>
                 <w:rFonts w:ascii="Calibri" w:cs="Calibri" w:eastAsia="Calibri" w:hAnsi="Calibri"/>
-                <w:sz w:val="22"/>
-                <w:szCs w:val="22"/>
+                <w:sz w:val="21"/>
+                <w:szCs w:val="21"/>
               </w:rPr>
               <w:t xml:space="preserve">+ Short-term debt</w:t>
             </w:r>
@@ -1918,8 +1955,8 @@
             <w:r>
               <w:rPr>
                 <w:rFonts w:ascii="Calibri" w:cs="Calibri" w:eastAsia="Calibri" w:hAnsi="Calibri"/>
-                <w:sz w:val="22"/>
-                <w:szCs w:val="22"/>
+                <w:sz w:val="21"/>
+                <w:szCs w:val="21"/>
               </w:rPr>
               <w:t xml:space="preserve">+ Inventory</w:t>
             </w:r>
@@ -1947,8 +1984,8 @@
                 <w:rFonts w:ascii="Calibri" w:cs="Calibri" w:eastAsia="Calibri" w:hAnsi="Calibri"/>
                 <w:b/>
                 <w:bCs/>
-                <w:sz w:val="22"/>
-                <w:szCs w:val="22"/>
+                <w:sz w:val="21"/>
+                <w:szCs w:val="21"/>
               </w:rPr>
               <w:t xml:space="preserve">= Current liabilities</w:t>
             </w:r>
@@ -1981,8 +2018,8 @@
                 <w:rFonts w:ascii="Calibri" w:cs="Calibri" w:eastAsia="Calibri" w:hAnsi="Calibri"/>
                 <w:b/>
                 <w:bCs/>
-                <w:sz w:val="22"/>
-                <w:szCs w:val="22"/>
+                <w:sz w:val="21"/>
+                <w:szCs w:val="21"/>
               </w:rPr>
               <w:t xml:space="preserve">= Current assets</w:t>
             </w:r>
@@ -2008,8 +2045,8 @@
             <w:r>
               <w:rPr>
                 <w:rFonts w:ascii="Calibri" w:cs="Calibri" w:eastAsia="Calibri" w:hAnsi="Calibri"/>
-                <w:sz w:val="22"/>
-                <w:szCs w:val="22"/>
+                <w:sz w:val="21"/>
+                <w:szCs w:val="21"/>
               </w:rPr>
               <w:t xml:space="preserve">+ Long-term debt</w:t>
             </w:r>
@@ -2040,8 +2077,8 @@
             <w:r>
               <w:rPr>
                 <w:rFonts w:ascii="Calibri" w:cs="Calibri" w:eastAsia="Calibri" w:hAnsi="Calibri"/>
-                <w:sz w:val="22"/>
-                <w:szCs w:val="22"/>
+                <w:sz w:val="21"/>
+                <w:szCs w:val="21"/>
               </w:rPr>
               <w:t xml:space="preserve">+ Gross PP&amp;E</w:t>
             </w:r>
@@ -2069,8 +2106,8 @@
                 <w:rFonts w:ascii="Calibri" w:cs="Calibri" w:eastAsia="Calibri" w:hAnsi="Calibri"/>
                 <w:b/>
                 <w:bCs/>
-                <w:sz w:val="22"/>
-                <w:szCs w:val="22"/>
+                <w:sz w:val="21"/>
+                <w:szCs w:val="21"/>
               </w:rPr>
               <w:t xml:space="preserve">= Total liabilities</w:t>
             </w:r>
@@ -2101,8 +2138,8 @@
             <w:r>
               <w:rPr>
                 <w:rFonts w:ascii="Calibri" w:cs="Calibri" w:eastAsia="Calibri" w:hAnsi="Calibri"/>
-                <w:sz w:val="22"/>
-                <w:szCs w:val="22"/>
+                <w:sz w:val="21"/>
+                <w:szCs w:val="21"/>
               </w:rPr>
               <w:t xml:space="preserve">– Accum. depreciation</w:t>
             </w:r>
@@ -2128,8 +2165,8 @@
             <w:r>
               <w:rPr>
                 <w:rFonts w:ascii="Calibri" w:cs="Calibri" w:eastAsia="Calibri" w:hAnsi="Calibri"/>
-                <w:sz w:val="22"/>
-                <w:szCs w:val="22"/>
+                <w:sz w:val="21"/>
+                <w:szCs w:val="21"/>
               </w:rPr>
               <w:t xml:space="preserve">+ Shareholders' equity</w:t>
             </w:r>
@@ -2162,8 +2199,8 @@
                 <w:rFonts w:ascii="Calibri" w:cs="Calibri" w:eastAsia="Calibri" w:hAnsi="Calibri"/>
                 <w:b/>
                 <w:bCs/>
-                <w:sz w:val="22"/>
-                <w:szCs w:val="22"/>
+                <w:sz w:val="21"/>
+                <w:szCs w:val="21"/>
               </w:rPr>
               <w:t xml:space="preserve">= Net PP&amp;E</w:t>
             </w:r>
@@ -2212,8 +2249,8 @@
             <w:r>
               <w:rPr>
                 <w:rFonts w:ascii="Calibri" w:cs="Calibri" w:eastAsia="Calibri" w:hAnsi="Calibri"/>
-                <w:sz w:val="22"/>
-                <w:szCs w:val="22"/>
+                <w:sz w:val="21"/>
+                <w:szCs w:val="21"/>
               </w:rPr>
               <w:t xml:space="preserve">+ Other assets</w:t>
             </w:r>
@@ -2264,8 +2301,8 @@
                 <w:rFonts w:ascii="Calibri" w:cs="Calibri" w:eastAsia="Calibri" w:hAnsi="Calibri"/>
                 <w:b/>
                 <w:bCs/>
-                <w:sz w:val="22"/>
-                <w:szCs w:val="22"/>
+                <w:sz w:val="21"/>
+                <w:szCs w:val="21"/>
               </w:rPr>
               <w:t xml:space="preserve">= TOTAL ASSETS</w:t>
             </w:r>
@@ -2293,8 +2330,8 @@
                 <w:rFonts w:ascii="Calibri" w:cs="Calibri" w:eastAsia="Calibri" w:hAnsi="Calibri"/>
                 <w:b/>
                 <w:bCs/>
-                <w:sz w:val="22"/>
-                <w:szCs w:val="22"/>
+                <w:sz w:val="21"/>
+                <w:szCs w:val="21"/>
               </w:rPr>
               <w:t xml:space="preserve">= TOTAL LIAB. + EQUITY</w:t>
             </w:r>
@@ -2316,16 +2353,16 @@
           <w:rFonts w:ascii="Calibri" w:cs="Calibri" w:eastAsia="Calibri" w:hAnsi="Calibri"/>
           <w:b/>
           <w:bCs/>
-          <w:sz w:val="22"/>
-          <w:szCs w:val="22"/>
+          <w:sz w:val="21"/>
+          <w:szCs w:val="21"/>
         </w:rPr>
         <w:t xml:space="preserve">Total assets = total liabilities + equity</w:t>
       </w:r>
       <w:r>
         <w:rPr>
           <w:rFonts w:ascii="Calibri" w:cs="Calibri" w:eastAsia="Calibri" w:hAnsi="Calibri"/>
-          <w:sz w:val="22"/>
-          <w:szCs w:val="22"/>
+          <w:sz w:val="21"/>
+          <w:szCs w:val="21"/>
         </w:rPr>
         <w:t xml:space="preserve">, always. One number missing (often cash)? Cash = total L+E – all other assets.</w:t>
       </w:r>
@@ -2342,8 +2379,8 @@
       <w:r>
         <w:rPr>
           <w:rFonts w:ascii="Calibri" w:cs="Calibri" w:eastAsia="Calibri" w:hAnsi="Calibri"/>
-          <w:sz w:val="22"/>
-          <w:szCs w:val="22"/>
+          <w:sz w:val="21"/>
+          <w:szCs w:val="21"/>
         </w:rPr>
         <w:t xml:space="preserve">Equity this year = equity last year + retained earnings + new stock – buybacks.</w:t>
       </w:r>
@@ -2360,8 +2397,8 @@
       <w:r>
         <w:rPr>
           <w:rFonts w:ascii="Calibri" w:cs="Calibri" w:eastAsia="Calibri" w:hAnsi="Calibri"/>
-          <w:sz w:val="22"/>
-          <w:szCs w:val="22"/>
+          <w:sz w:val="21"/>
+          <w:szCs w:val="21"/>
         </w:rPr>
         <w:t xml:space="preserve">Debt = short-term + long-term debt (AP is not debt). Only debt and equity given? Total assets = debt + equity.</w:t>
       </w:r>
@@ -2378,8 +2415,8 @@
       <w:r>
         <w:rPr>
           <w:rFonts w:ascii="Calibri" w:cs="Calibri" w:eastAsia="Calibri" w:hAnsi="Calibri"/>
-          <w:sz w:val="22"/>
-          <w:szCs w:val="22"/>
+          <w:sz w:val="21"/>
+          <w:szCs w:val="21"/>
         </w:rPr>
         <w:t xml:space="preserve">New cash balance: subtract AR, inventory and net PP&amp;E from TL + equity.</w:t>
       </w:r>
@@ -2396,8 +2433,8 @@
           <w:b/>
           <w:bCs/>
           <w:color w:val="FFFFFF"/>
-          <w:sz w:val="22"/>
-          <w:szCs w:val="22"/>
+          <w:sz w:val="21"/>
+          <w:szCs w:val="21"/>
         </w:rPr>
         <w:t xml:space="preserve">CASH FLOW STATEMENT (cash ≠ net income)</w:t>
       </w:r>
@@ -2409,21 +2446,21 @@
       <w:r>
         <w:rPr>
           <w:rFonts w:ascii="Calibri" w:cs="Calibri" w:eastAsia="Calibri" w:hAnsi="Calibri"/>
-          <w:sz w:val="22"/>
-          <w:szCs w:val="22"/>
-        </w:rPr>
-        <w:t xml:space="preserve">Δ = change = this year – last year (ΔAR = AR 2025 – AR 2024).</w:t>
-      </w:r>
-    </w:p>
-    <w:p>
-      <w:pPr>
-        <w:spacing w:after="0" w:before="0"/>
-      </w:pPr>
-      <w:r>
-        <w:rPr>
-          <w:rFonts w:ascii="Calibri" w:cs="Calibri" w:eastAsia="Calibri" w:hAnsi="Calibri"/>
-          <w:sz w:val="22"/>
-          <w:szCs w:val="22"/>
+          <w:sz w:val="21"/>
+          <w:szCs w:val="21"/>
+        </w:rPr>
+        <w:t xml:space="preserve">Δ (delta) = change = this year – last year. Example: ΔAR = AR 2025 – AR 2024.</w:t>
+      </w:r>
+    </w:p>
+    <w:p>
+      <w:pPr>
+        <w:spacing w:after="0" w:before="0"/>
+      </w:pPr>
+      <w:r>
+        <w:rPr>
+          <w:rFonts w:ascii="Calibri" w:cs="Calibri" w:eastAsia="Calibri" w:hAnsi="Calibri"/>
+          <w:sz w:val="21"/>
+          <w:szCs w:val="21"/>
         </w:rPr>
         <w:t xml:space="preserve">CFO = Net income + Depreciation – ΔNWC</w:t>
       </w:r>
@@ -2435,8 +2472,8 @@
       <w:r>
         <w:rPr>
           <w:rFonts w:ascii="Calibri" w:cs="Calibri" w:eastAsia="Calibri" w:hAnsi="Calibri"/>
-          <w:sz w:val="22"/>
-          <w:szCs w:val="22"/>
+          <w:sz w:val="21"/>
+          <w:szCs w:val="21"/>
         </w:rPr>
         <w:t xml:space="preserve">ΔNWC = ΔAR + ΔI – ΔAP</w:t>
       </w:r>
@@ -2448,8 +2485,8 @@
       <w:r>
         <w:rPr>
           <w:rFonts w:ascii="Calibri" w:cs="Calibri" w:eastAsia="Calibri" w:hAnsi="Calibri"/>
-          <w:sz w:val="22"/>
-          <w:szCs w:val="22"/>
+          <w:sz w:val="21"/>
+          <w:szCs w:val="21"/>
         </w:rPr>
         <w:t xml:space="preserve">– ↑AR  – ↑Inventory  + ↑AP  (asset ↑ uses cash; liability ↑ gives cash)</w:t>
       </w:r>
@@ -2463,8 +2500,8 @@
           <w:rFonts w:ascii="Calibri" w:cs="Calibri" w:eastAsia="Calibri" w:hAnsi="Calibri"/>
           <w:b/>
           <w:bCs/>
-          <w:sz w:val="22"/>
-          <w:szCs w:val="22"/>
+          <w:sz w:val="21"/>
+          <w:szCs w:val="21"/>
         </w:rPr>
         <w:t xml:space="preserve">= Cash from operations (CFO)</w:t>
       </w:r>
@@ -2476,8 +2513,8 @@
       <w:r>
         <w:rPr>
           <w:rFonts w:ascii="Calibri" w:cs="Calibri" w:eastAsia="Calibri" w:hAnsi="Calibri"/>
-          <w:sz w:val="22"/>
-          <w:szCs w:val="22"/>
+          <w:sz w:val="21"/>
+          <w:szCs w:val="21"/>
         </w:rPr>
         <w:t xml:space="preserve">– CapEx, where </w:t>
       </w:r>
@@ -2486,8 +2523,8 @@
           <w:rFonts w:ascii="Calibri" w:cs="Calibri" w:eastAsia="Calibri" w:hAnsi="Calibri"/>
           <w:b/>
           <w:bCs/>
-          <w:sz w:val="22"/>
-          <w:szCs w:val="22"/>
+          <w:sz w:val="21"/>
+          <w:szCs w:val="21"/>
         </w:rPr>
         <w:t xml:space="preserve">CapEx = ΔNet PP&amp;E + depreciation</w:t>
       </w:r>
@@ -2501,8 +2538,8 @@
           <w:rFonts w:ascii="Calibri" w:cs="Calibri" w:eastAsia="Calibri" w:hAnsi="Calibri"/>
           <w:b/>
           <w:bCs/>
-          <w:sz w:val="22"/>
-          <w:szCs w:val="22"/>
+          <w:sz w:val="21"/>
+          <w:szCs w:val="21"/>
         </w:rPr>
         <w:t xml:space="preserve">= Cash from investing (CFI)</w:t>
       </w:r>
@@ -2514,8 +2551,8 @@
       <w:r>
         <w:rPr>
           <w:rFonts w:ascii="Calibri" w:cs="Calibri" w:eastAsia="Calibri" w:hAnsi="Calibri"/>
-          <w:sz w:val="22"/>
-          <w:szCs w:val="22"/>
+          <w:sz w:val="21"/>
+          <w:szCs w:val="21"/>
         </w:rPr>
         <w:t xml:space="preserve">+ New debt (ΔDebt) + new stock – dividends</w:t>
       </w:r>
@@ -2529,8 +2566,8 @@
           <w:rFonts w:ascii="Calibri" w:cs="Calibri" w:eastAsia="Calibri" w:hAnsi="Calibri"/>
           <w:b/>
           <w:bCs/>
-          <w:sz w:val="22"/>
-          <w:szCs w:val="22"/>
+          <w:sz w:val="21"/>
+          <w:szCs w:val="21"/>
         </w:rPr>
         <w:t xml:space="preserve">= Cash from financing (CFF)</w:t>
       </w:r>
@@ -2544,16 +2581,16 @@
           <w:rFonts w:ascii="Calibri" w:cs="Calibri" w:eastAsia="Calibri" w:hAnsi="Calibri"/>
           <w:b/>
           <w:bCs/>
-          <w:sz w:val="22"/>
-          <w:szCs w:val="22"/>
+          <w:sz w:val="21"/>
+          <w:szCs w:val="21"/>
         </w:rPr>
         <w:t xml:space="preserve">CFO + CFI + CFF = change in cash</w:t>
       </w:r>
       <w:r>
         <w:rPr>
           <w:rFonts w:ascii="Calibri" w:cs="Calibri" w:eastAsia="Calibri" w:hAnsi="Calibri"/>
-          <w:sz w:val="22"/>
-          <w:szCs w:val="22"/>
+          <w:sz w:val="21"/>
+          <w:szCs w:val="21"/>
         </w:rPr>
         <w:t xml:space="preserve"> on the balance sheet ✓</w:t>
       </w:r>
@@ -2567,16 +2604,16 @@
           <w:rFonts w:ascii="Calibri" w:cs="Calibri" w:eastAsia="Calibri" w:hAnsi="Calibri"/>
           <w:b/>
           <w:bCs/>
-          <w:sz w:val="22"/>
-          <w:szCs w:val="22"/>
+          <w:sz w:val="21"/>
+          <w:szCs w:val="21"/>
         </w:rPr>
         <w:t xml:space="preserve">Free cash flow</w:t>
       </w:r>
       <w:r>
         <w:rPr>
           <w:rFonts w:ascii="Calibri" w:cs="Calibri" w:eastAsia="Calibri" w:hAnsi="Calibri"/>
-          <w:sz w:val="22"/>
-          <w:szCs w:val="22"/>
+          <w:sz w:val="21"/>
+          <w:szCs w:val="21"/>
         </w:rPr>
         <w:t xml:space="preserve"> = EBIT × (1 – t) + Dep – CapEx – ΔNWC, where ΔNWC = ΔAR + ΔInv – ΔAP</w:t>
       </w:r>
@@ -2593,8 +2630,8 @@
           <w:b/>
           <w:bCs/>
           <w:color w:val="FFFFFF"/>
-          <w:sz w:val="22"/>
-          <w:szCs w:val="22"/>
+          <w:sz w:val="21"/>
+          <w:szCs w:val="21"/>
         </w:rPr>
         <w:t xml:space="preserve">RATIOS (use year-end numbers)</w:t>
       </w:r>
@@ -2640,8 +2677,8 @@
             <w:r>
               <w:rPr>
                 <w:rFonts w:ascii="Calibri" w:cs="Calibri" w:eastAsia="Calibri" w:hAnsi="Calibri"/>
-                <w:sz w:val="22"/>
-                <w:szCs w:val="22"/>
+                <w:sz w:val="21"/>
+                <w:szCs w:val="21"/>
               </w:rPr>
               <w:t xml:space="preserve">Gross margin</w:t>
             </w:r>
@@ -2667,8 +2704,8 @@
             <w:r>
               <w:rPr>
                 <w:rFonts w:ascii="Calibri" w:cs="Calibri" w:eastAsia="Calibri" w:hAnsi="Calibri"/>
-                <w:sz w:val="22"/>
-                <w:szCs w:val="22"/>
+                <w:sz w:val="21"/>
+                <w:szCs w:val="21"/>
               </w:rPr>
               <w:t xml:space="preserve">Gross profit / Revenue</w:t>
             </w:r>
@@ -2700,8 +2737,8 @@
             <w:r>
               <w:rPr>
                 <w:rFonts w:ascii="Calibri" w:cs="Calibri" w:eastAsia="Calibri" w:hAnsi="Calibri"/>
-                <w:sz w:val="22"/>
-                <w:szCs w:val="22"/>
+                <w:sz w:val="21"/>
+                <w:szCs w:val="21"/>
               </w:rPr>
               <w:t xml:space="preserve">Operating margin</w:t>
             </w:r>
@@ -2727,8 +2764,8 @@
             <w:r>
               <w:rPr>
                 <w:rFonts w:ascii="Calibri" w:cs="Calibri" w:eastAsia="Calibri" w:hAnsi="Calibri"/>
-                <w:sz w:val="22"/>
-                <w:szCs w:val="22"/>
+                <w:sz w:val="21"/>
+                <w:szCs w:val="21"/>
               </w:rPr>
               <w:t xml:space="preserve">EBIT / Revenue</w:t>
             </w:r>
@@ -2760,8 +2797,8 @@
             <w:r>
               <w:rPr>
                 <w:rFonts w:ascii="Calibri" w:cs="Calibri" w:eastAsia="Calibri" w:hAnsi="Calibri"/>
-                <w:sz w:val="22"/>
-                <w:szCs w:val="22"/>
+                <w:sz w:val="21"/>
+                <w:szCs w:val="21"/>
               </w:rPr>
               <w:t xml:space="preserve">Profit margin</w:t>
             </w:r>
@@ -2787,8 +2824,8 @@
             <w:r>
               <w:rPr>
                 <w:rFonts w:ascii="Calibri" w:cs="Calibri" w:eastAsia="Calibri" w:hAnsi="Calibri"/>
-                <w:sz w:val="22"/>
-                <w:szCs w:val="22"/>
+                <w:sz w:val="21"/>
+                <w:szCs w:val="21"/>
               </w:rPr>
               <w:t xml:space="preserve">Net income / Revenue</w:t>
             </w:r>
@@ -2820,8 +2857,8 @@
             <w:r>
               <w:rPr>
                 <w:rFonts w:ascii="Calibri" w:cs="Calibri" w:eastAsia="Calibri" w:hAnsi="Calibri"/>
-                <w:sz w:val="22"/>
-                <w:szCs w:val="22"/>
+                <w:sz w:val="21"/>
+                <w:szCs w:val="21"/>
               </w:rPr>
               <w:t xml:space="preserve">ROE</w:t>
             </w:r>
@@ -2847,8 +2884,8 @@
             <w:r>
               <w:rPr>
                 <w:rFonts w:ascii="Calibri" w:cs="Calibri" w:eastAsia="Calibri" w:hAnsi="Calibri"/>
-                <w:sz w:val="22"/>
-                <w:szCs w:val="22"/>
+                <w:sz w:val="21"/>
+                <w:szCs w:val="21"/>
               </w:rPr>
               <w:t xml:space="preserve">Net income / Equity</w:t>
             </w:r>
@@ -2880,8 +2917,8 @@
             <w:r>
               <w:rPr>
                 <w:rFonts w:ascii="Calibri" w:cs="Calibri" w:eastAsia="Calibri" w:hAnsi="Calibri"/>
-                <w:sz w:val="22"/>
-                <w:szCs w:val="22"/>
+                <w:sz w:val="21"/>
+                <w:szCs w:val="21"/>
               </w:rPr>
               <w:t xml:space="preserve">ROA</w:t>
             </w:r>
@@ -2907,8 +2944,8 @@
             <w:r>
               <w:rPr>
                 <w:rFonts w:ascii="Calibri" w:cs="Calibri" w:eastAsia="Calibri" w:hAnsi="Calibri"/>
-                <w:sz w:val="22"/>
-                <w:szCs w:val="22"/>
+                <w:sz w:val="21"/>
+                <w:szCs w:val="21"/>
               </w:rPr>
               <w:t xml:space="preserve">Net income / Total assets</w:t>
             </w:r>
@@ -2940,8 +2977,8 @@
             <w:r>
               <w:rPr>
                 <w:rFonts w:ascii="Calibri" w:cs="Calibri" w:eastAsia="Calibri" w:hAnsi="Calibri"/>
-                <w:sz w:val="22"/>
-                <w:szCs w:val="22"/>
+                <w:sz w:val="21"/>
+                <w:szCs w:val="21"/>
               </w:rPr>
               <w:t xml:space="preserve">Asset turnover</w:t>
             </w:r>
@@ -2967,8 +3004,8 @@
             <w:r>
               <w:rPr>
                 <w:rFonts w:ascii="Calibri" w:cs="Calibri" w:eastAsia="Calibri" w:hAnsi="Calibri"/>
-                <w:sz w:val="22"/>
-                <w:szCs w:val="22"/>
+                <w:sz w:val="21"/>
+                <w:szCs w:val="21"/>
               </w:rPr>
               <w:t xml:space="preserve">Revenue / Total assets</w:t>
             </w:r>
@@ -3000,8 +3037,8 @@
             <w:r>
               <w:rPr>
                 <w:rFonts w:ascii="Calibri" w:cs="Calibri" w:eastAsia="Calibri" w:hAnsi="Calibri"/>
-                <w:sz w:val="22"/>
-                <w:szCs w:val="22"/>
+                <w:sz w:val="21"/>
+                <w:szCs w:val="21"/>
               </w:rPr>
               <w:t xml:space="preserve">Equity multiplier</w:t>
             </w:r>
@@ -3027,8 +3064,8 @@
             <w:r>
               <w:rPr>
                 <w:rFonts w:ascii="Calibri" w:cs="Calibri" w:eastAsia="Calibri" w:hAnsi="Calibri"/>
-                <w:sz w:val="22"/>
-                <w:szCs w:val="22"/>
+                <w:sz w:val="21"/>
+                <w:szCs w:val="21"/>
               </w:rPr>
               <w:t xml:space="preserve">Total assets / Equity</w:t>
             </w:r>
@@ -3062,8 +3099,8 @@
                 <w:rFonts w:ascii="Calibri" w:cs="Calibri" w:eastAsia="Calibri" w:hAnsi="Calibri"/>
                 <w:b/>
                 <w:bCs/>
-                <w:sz w:val="22"/>
-                <w:szCs w:val="22"/>
+                <w:sz w:val="21"/>
+                <w:szCs w:val="21"/>
               </w:rPr>
               <w:t xml:space="preserve">DuPont</w:t>
             </w:r>
@@ -3091,8 +3128,8 @@
                 <w:rFonts w:ascii="Calibri" w:cs="Calibri" w:eastAsia="Calibri" w:hAnsi="Calibri"/>
                 <w:b/>
                 <w:bCs/>
-                <w:sz w:val="22"/>
-                <w:szCs w:val="22"/>
+                <w:sz w:val="21"/>
+                <w:szCs w:val="21"/>
               </w:rPr>
               <w:t xml:space="preserve">ROE = Profit margin × Asset turnover × Equity multiplier</w:t>
             </w:r>
@@ -3124,8 +3161,8 @@
             <w:r>
               <w:rPr>
                 <w:rFonts w:ascii="Calibri" w:cs="Calibri" w:eastAsia="Calibri" w:hAnsi="Calibri"/>
-                <w:sz w:val="22"/>
-                <w:szCs w:val="22"/>
+                <w:sz w:val="21"/>
+                <w:szCs w:val="21"/>
               </w:rPr>
               <w:t xml:space="preserve">Sustainable growth</w:t>
             </w:r>
@@ -3151,8 +3188,8 @@
             <w:r>
               <w:rPr>
                 <w:rFonts w:ascii="Calibri" w:cs="Calibri" w:eastAsia="Calibri" w:hAnsi="Calibri"/>
-                <w:sz w:val="22"/>
-                <w:szCs w:val="22"/>
+                <w:sz w:val="21"/>
+                <w:szCs w:val="21"/>
               </w:rPr>
               <w:t xml:space="preserve">ROE × b   (or ROE·b / (1 – ROE·b))</w:t>
             </w:r>
@@ -3161,8 +3198,8 @@
             <w:r>
               <w:rPr>
                 <w:rFonts w:ascii="Calibri" w:cs="Calibri" w:eastAsia="Calibri" w:hAnsi="Calibri"/>
-                <w:sz w:val="22"/>
-                <w:szCs w:val="22"/>
+                <w:sz w:val="21"/>
+                <w:szCs w:val="21"/>
               </w:rPr>
               <w:t xml:space="preserve">b = retention ratio = retained earnings / net income, or 1 – dividend payout ratio</w:t>
             </w:r>
@@ -3194,8 +3231,8 @@
             <w:r>
               <w:rPr>
                 <w:rFonts w:ascii="Calibri" w:cs="Calibri" w:eastAsia="Calibri" w:hAnsi="Calibri"/>
-                <w:sz w:val="22"/>
-                <w:szCs w:val="22"/>
+                <w:sz w:val="21"/>
+                <w:szCs w:val="21"/>
               </w:rPr>
               <w:t xml:space="preserve">Internal growth</w:t>
             </w:r>
@@ -3221,8 +3258,8 @@
             <w:r>
               <w:rPr>
                 <w:rFonts w:ascii="Calibri" w:cs="Calibri" w:eastAsia="Calibri" w:hAnsi="Calibri"/>
-                <w:sz w:val="22"/>
-                <w:szCs w:val="22"/>
+                <w:sz w:val="21"/>
+                <w:szCs w:val="21"/>
               </w:rPr>
               <w:t xml:space="preserve">ROA × b   (or ROA·b / (1 – ROA·b))</w:t>
             </w:r>
@@ -3254,8 +3291,8 @@
             <w:r>
               <w:rPr>
                 <w:rFonts w:ascii="Calibri" w:cs="Calibri" w:eastAsia="Calibri" w:hAnsi="Calibri"/>
-                <w:sz w:val="22"/>
-                <w:szCs w:val="22"/>
+                <w:sz w:val="21"/>
+                <w:szCs w:val="21"/>
               </w:rPr>
               <w:t xml:space="preserve">Current ratio</w:t>
             </w:r>
@@ -3281,8 +3318,8 @@
             <w:r>
               <w:rPr>
                 <w:rFonts w:ascii="Calibri" w:cs="Calibri" w:eastAsia="Calibri" w:hAnsi="Calibri"/>
-                <w:sz w:val="22"/>
-                <w:szCs w:val="22"/>
+                <w:sz w:val="21"/>
+                <w:szCs w:val="21"/>
               </w:rPr>
               <w:t xml:space="preserve">Current assets / Current liabilities</w:t>
             </w:r>
@@ -3314,8 +3351,8 @@
             <w:r>
               <w:rPr>
                 <w:rFonts w:ascii="Calibri" w:cs="Calibri" w:eastAsia="Calibri" w:hAnsi="Calibri"/>
-                <w:sz w:val="22"/>
-                <w:szCs w:val="22"/>
+                <w:sz w:val="21"/>
+                <w:szCs w:val="21"/>
               </w:rPr>
               <w:t xml:space="preserve">Interest coverage</w:t>
             </w:r>
@@ -3341,8 +3378,8 @@
             <w:r>
               <w:rPr>
                 <w:rFonts w:ascii="Calibri" w:cs="Calibri" w:eastAsia="Calibri" w:hAnsi="Calibri"/>
-                <w:sz w:val="22"/>
-                <w:szCs w:val="22"/>
+                <w:sz w:val="21"/>
+                <w:szCs w:val="21"/>
               </w:rPr>
               <w:t xml:space="preserve">EBIT / Interest expense</w:t>
             </w:r>
@@ -3374,8 +3411,8 @@
             <w:r>
               <w:rPr>
                 <w:rFonts w:ascii="Calibri" w:cs="Calibri" w:eastAsia="Calibri" w:hAnsi="Calibri"/>
-                <w:sz w:val="22"/>
-                <w:szCs w:val="22"/>
+                <w:sz w:val="21"/>
+                <w:szCs w:val="21"/>
               </w:rPr>
               <w:t xml:space="preserve">Debt-to-equity</w:t>
             </w:r>
@@ -3401,8 +3438,8 @@
             <w:r>
               <w:rPr>
                 <w:rFonts w:ascii="Calibri" w:cs="Calibri" w:eastAsia="Calibri" w:hAnsi="Calibri"/>
-                <w:sz w:val="22"/>
-                <w:szCs w:val="22"/>
+                <w:sz w:val="21"/>
+                <w:szCs w:val="21"/>
               </w:rPr>
               <w:t xml:space="preserve">Total debt / Equity</w:t>
             </w:r>
@@ -3417,8 +3454,8 @@
       <w:r>
         <w:rPr>
           <w:rFonts w:ascii="Calibri" w:cs="Calibri" w:eastAsia="Calibri" w:hAnsi="Calibri"/>
-          <w:sz w:val="22"/>
-          <w:szCs w:val="22"/>
+          <w:sz w:val="21"/>
+          <w:szCs w:val="21"/>
         </w:rPr>
         <w:t xml:space="preserve">Profit margin = profitability; turnover = efficiency; multiplier = leverage (raises ROE and risk).</w:t>
       </w:r>
@@ -3435,8 +3472,8 @@
           <w:b/>
           <w:bCs/>
           <w:color w:val="FFFFFF"/>
-          <w:sz w:val="22"/>
-          <w:szCs w:val="22"/>
+          <w:sz w:val="21"/>
+          <w:szCs w:val="21"/>
         </w:rPr>
         <w:t xml:space="preserve">WHAT THE FIRM IS WORTH</w:t>
       </w:r>
@@ -3448,8 +3485,8 @@
       <w:r>
         <w:rPr>
           <w:rFonts w:ascii="Calibri" w:cs="Calibri" w:eastAsia="Calibri" w:hAnsi="Calibri"/>
-          <w:sz w:val="22"/>
-          <w:szCs w:val="22"/>
+          <w:sz w:val="21"/>
+          <w:szCs w:val="21"/>
         </w:rPr>
         <w:t xml:space="preserve">Market cap = shares × share price (= market value of equity)</w:t>
       </w:r>
@@ -3463,8 +3500,8 @@
           <w:rFonts w:ascii="Calibri" w:cs="Calibri" w:eastAsia="Calibri" w:hAnsi="Calibri"/>
           <w:b/>
           <w:bCs/>
-          <w:sz w:val="22"/>
-          <w:szCs w:val="22"/>
+          <w:sz w:val="21"/>
+          <w:szCs w:val="21"/>
         </w:rPr>
         <w:t xml:space="preserve">Enterprise value (EV) = market cap + debt (ST + LT) – excess cash</w:t>
       </w:r>
@@ -3476,8 +3513,8 @@
       <w:r>
         <w:rPr>
           <w:rFonts w:ascii="Calibri" w:cs="Calibri" w:eastAsia="Calibri" w:hAnsi="Calibri"/>
-          <w:sz w:val="22"/>
-          <w:szCs w:val="22"/>
+          <w:sz w:val="21"/>
+          <w:szCs w:val="21"/>
         </w:rPr>
         <w:t xml:space="preserve">Given EV (e.g. EV = 8 × EBIT): equity value = EV – debt + cash</w:t>
       </w:r>
@@ -3489,8 +3526,8 @@
       <w:r>
         <w:rPr>
           <w:rFonts w:ascii="Calibri" w:cs="Calibri" w:eastAsia="Calibri" w:hAnsi="Calibri"/>
-          <w:sz w:val="22"/>
-          <w:szCs w:val="22"/>
+          <w:sz w:val="21"/>
+          <w:szCs w:val="21"/>
         </w:rPr>
         <w:t xml:space="preserve">P/E = market cap / net income (= price / EPS).  EV/EBITDA = EV / EBITDA</w:t>
       </w:r>
@@ -3507,23 +3544,82 @@
           <w:b/>
           <w:bCs/>
           <w:color w:val="FFFFFF"/>
-          <w:sz w:val="22"/>
-          <w:szCs w:val="22"/>
+          <w:sz w:val="21"/>
+          <w:szCs w:val="21"/>
         </w:rPr>
         <w:t xml:space="preserve">HOW TO ANSWER A RATIO QUESTION</w:t>
       </w:r>
     </w:p>
     <w:p>
       <w:pPr>
-        <w:spacing w:after="0" w:before="0"/>
-      </w:pPr>
-      <w:r>
-        <w:rPr>
-          <w:rFonts w:ascii="Calibri" w:cs="Calibri" w:eastAsia="Calibri" w:hAnsi="Calibri"/>
-          <w:sz w:val="22"/>
-          <w:szCs w:val="22"/>
-        </w:rPr>
-        <w:t xml:space="preserve">Type the statements in, then put each ratio in its own labeled cell as a formula. Check DuPont product = ROE. To interpret, say which number moved and why.</w:t>
+        <w:pStyle w:val="ListParagraph"/>
+        <w:numPr>
+          <w:ilvl w:val="0"/>
+          <w:numId w:val="3"/>
+        </w:numPr>
+        <w:spacing w:after="0" w:before="0"/>
+      </w:pPr>
+      <w:r>
+        <w:rPr>
+          <w:rFonts w:ascii="Calibri" w:cs="Calibri" w:eastAsia="Calibri" w:hAnsi="Calibri"/>
+          <w:sz w:val="21"/>
+          <w:szCs w:val="21"/>
+        </w:rPr>
+        <w:t xml:space="preserve">Type the statements into Excel (templates above).</w:t>
+      </w:r>
+    </w:p>
+    <w:p>
+      <w:pPr>
+        <w:pStyle w:val="ListParagraph"/>
+        <w:numPr>
+          <w:ilvl w:val="0"/>
+          <w:numId w:val="3"/>
+        </w:numPr>
+        <w:spacing w:after="0" w:before="0"/>
+      </w:pPr>
+      <w:r>
+        <w:rPr>
+          <w:rFonts w:ascii="Calibri" w:cs="Calibri" w:eastAsia="Calibri" w:hAnsi="Calibri"/>
+          <w:sz w:val="21"/>
+          <w:szCs w:val="21"/>
+        </w:rPr>
+        <w:t xml:space="preserve">Put each ratio in its own labeled cell, as a formula pointing at the statement cells.</w:t>
+      </w:r>
+    </w:p>
+    <w:p>
+      <w:pPr>
+        <w:pStyle w:val="ListParagraph"/>
+        <w:numPr>
+          <w:ilvl w:val="0"/>
+          <w:numId w:val="3"/>
+        </w:numPr>
+        <w:spacing w:after="0" w:before="0"/>
+      </w:pPr>
+      <w:r>
+        <w:rPr>
+          <w:rFonts w:ascii="Calibri" w:cs="Calibri" w:eastAsia="Calibri" w:hAnsi="Calibri"/>
+          <w:sz w:val="21"/>
+          <w:szCs w:val="21"/>
+        </w:rPr>
+        <w:t xml:space="preserve">Format as % where it is a percent. Check that the DuPont product equals ROE.</w:t>
+      </w:r>
+    </w:p>
+    <w:p>
+      <w:pPr>
+        <w:pStyle w:val="ListParagraph"/>
+        <w:numPr>
+          <w:ilvl w:val="0"/>
+          <w:numId w:val="3"/>
+        </w:numPr>
+        <w:spacing w:after="0" w:before="0"/>
+      </w:pPr>
+      <w:r>
+        <w:rPr>
+          <w:rFonts w:ascii="Calibri" w:cs="Calibri" w:eastAsia="Calibri" w:hAnsi="Calibri"/>
+          <w:sz w:val="21"/>
+          <w:szCs w:val="21"/>
+        </w:rPr>
+        <w:t xml:space="preserve">Asked to interpret? Say which number rose or fell, and why it matters.</w:t>
       </w:r>
     </w:p>
     <w:p>
@@ -3538,8 +3634,8 @@
           <w:b/>
           <w:bCs/>
           <w:color w:val="FFFFFF"/>
-          <w:sz w:val="22"/>
-          <w:szCs w:val="22"/>
+          <w:sz w:val="21"/>
+          <w:szCs w:val="21"/>
         </w:rPr>
         <w:t xml:space="preserve">WORKED EXAMPLE (2025 exam, Ferrario)</w:t>
       </w:r>
@@ -3551,8 +3647,8 @@
       <w:r>
         <w:rPr>
           <w:rFonts w:ascii="Calibri" w:cs="Calibri" w:eastAsia="Calibri" w:hAnsi="Calibri"/>
-          <w:sz w:val="22"/>
-          <w:szCs w:val="22"/>
+          <w:sz w:val="21"/>
+          <w:szCs w:val="21"/>
         </w:rPr>
         <w:t xml:space="preserve">Revenue 1,000 – COGS 600 = </w:t>
       </w:r>
@@ -3561,16 +3657,16 @@
           <w:rFonts w:ascii="Calibri" w:cs="Calibri" w:eastAsia="Calibri" w:hAnsi="Calibri"/>
           <w:b/>
           <w:bCs/>
-          <w:sz w:val="22"/>
-          <w:szCs w:val="22"/>
+          <w:sz w:val="21"/>
+          <w:szCs w:val="21"/>
         </w:rPr>
         <w:t xml:space="preserve">GP 400</w:t>
       </w:r>
       <w:r>
         <w:rPr>
           <w:rFonts w:ascii="Calibri" w:cs="Calibri" w:eastAsia="Calibri" w:hAnsi="Calibri"/>
-          <w:sz w:val="22"/>
-          <w:szCs w:val="22"/>
+          <w:sz w:val="21"/>
+          <w:szCs w:val="21"/>
         </w:rPr>
         <w:t xml:space="preserve"> (gross margin 40%) – SG&amp;A 100 = EBITDA 300 – Dep 60 = </w:t>
       </w:r>
@@ -3579,16 +3675,16 @@
           <w:rFonts w:ascii="Calibri" w:cs="Calibri" w:eastAsia="Calibri" w:hAnsi="Calibri"/>
           <w:b/>
           <w:bCs/>
-          <w:sz w:val="22"/>
-          <w:szCs w:val="22"/>
+          <w:sz w:val="21"/>
+          <w:szCs w:val="21"/>
         </w:rPr>
         <w:t xml:space="preserve">EBIT 240</w:t>
       </w:r>
       <w:r>
         <w:rPr>
           <w:rFonts w:ascii="Calibri" w:cs="Calibri" w:eastAsia="Calibri" w:hAnsi="Calibri"/>
-          <w:sz w:val="22"/>
-          <w:szCs w:val="22"/>
+          <w:sz w:val="21"/>
+          <w:szCs w:val="21"/>
         </w:rPr>
         <w:t xml:space="preserve"> – interest 25 = EBT 215 – tax 21% (45.15) = </w:t>
       </w:r>
@@ -3597,16 +3693,16 @@
           <w:rFonts w:ascii="Calibri" w:cs="Calibri" w:eastAsia="Calibri" w:hAnsi="Calibri"/>
           <w:b/>
           <w:bCs/>
-          <w:sz w:val="22"/>
-          <w:szCs w:val="22"/>
+          <w:sz w:val="21"/>
+          <w:szCs w:val="21"/>
         </w:rPr>
         <w:t xml:space="preserve">NI 169.85</w:t>
       </w:r>
       <w:r>
         <w:rPr>
           <w:rFonts w:ascii="Calibri" w:cs="Calibri" w:eastAsia="Calibri" w:hAnsi="Calibri"/>
-          <w:sz w:val="22"/>
-          <w:szCs w:val="22"/>
+          <w:sz w:val="21"/>
+          <w:szCs w:val="21"/>
         </w:rPr>
         <w:t xml:space="preserve"> – div 60 = RE 109.85.</w:t>
       </w:r>
@@ -3618,8 +3714,8 @@
       <w:r>
         <w:rPr>
           <w:rFonts w:ascii="Calibri" w:cs="Calibri" w:eastAsia="Calibri" w:hAnsi="Calibri"/>
-          <w:sz w:val="22"/>
-          <w:szCs w:val="22"/>
+          <w:sz w:val="21"/>
+          <w:szCs w:val="21"/>
         </w:rPr>
         <w:t xml:space="preserve">Equity 1,200 + debt 500 = total assets 1,700. </w:t>
       </w:r>
@@ -3628,16 +3724,16 @@
           <w:rFonts w:ascii="Calibri" w:cs="Calibri" w:eastAsia="Calibri" w:hAnsi="Calibri"/>
           <w:b/>
           <w:bCs/>
-          <w:sz w:val="22"/>
-          <w:szCs w:val="22"/>
+          <w:sz w:val="21"/>
+          <w:szCs w:val="21"/>
         </w:rPr>
         <w:t xml:space="preserve">ROE</w:t>
       </w:r>
       <w:r>
         <w:rPr>
           <w:rFonts w:ascii="Calibri" w:cs="Calibri" w:eastAsia="Calibri" w:hAnsi="Calibri"/>
-          <w:sz w:val="22"/>
-          <w:szCs w:val="22"/>
+          <w:sz w:val="21"/>
+          <w:szCs w:val="21"/>
         </w:rPr>
         <w:t xml:space="preserve"> = 169.85 / 1,200 = 14.15% = 16.99% × 0.588 × 1.417. b = 109.85 / 169.85 = 0.647; SGR = 14.15% × 0.647 = 9.15%.</w:t>
       </w:r>
@@ -3649,8 +3745,8 @@
       <w:r>
         <w:rPr>
           <w:rFonts w:ascii="Calibri" w:cs="Calibri" w:eastAsia="Calibri" w:hAnsi="Calibri"/>
-          <w:sz w:val="22"/>
-          <w:szCs w:val="22"/>
+          <w:sz w:val="21"/>
+          <w:szCs w:val="21"/>
         </w:rPr>
         <w:t xml:space="preserve">EV = 8 × 240 = 1,920. Equity = 1,920 – 500 = 1,420. P/E = 1,420 / 169.85 = 8.36.</w:t>
       </w:r>
@@ -3672,8 +3768,8 @@
           <w:b/>
           <w:bCs/>
           <w:color w:val="FFFFFF"/>
-          <w:sz w:val="22"/>
-          <w:szCs w:val="22"/>
+          <w:sz w:val="21"/>
+          <w:szCs w:val="21"/>
         </w:rPr>
         <w:t xml:space="preserve">TIME VALUE OF MONEY (draw a timeline; t = 0 is today)</w:t>
       </w:r>
@@ -3687,16 +3783,16 @@
           <w:rFonts w:ascii="Calibri" w:cs="Calibri" w:eastAsia="Calibri" w:hAnsi="Calibri"/>
           <w:b/>
           <w:bCs/>
-          <w:sz w:val="22"/>
-          <w:szCs w:val="22"/>
+          <w:sz w:val="21"/>
+          <w:szCs w:val="21"/>
         </w:rPr>
         <w:t xml:space="preserve">PV = CF / (1+r)^t</w:t>
       </w:r>
       <w:r>
         <w:rPr>
           <w:rFonts w:ascii="Calibri" w:cs="Calibri" w:eastAsia="Calibri" w:hAnsi="Calibri"/>
-          <w:sz w:val="22"/>
-          <w:szCs w:val="22"/>
+          <w:sz w:val="21"/>
+          <w:szCs w:val="21"/>
         </w:rPr>
         <w:t xml:space="preserve">   </w:t>
       </w:r>
@@ -3705,16 +3801,16 @@
           <w:rFonts w:ascii="Calibri" w:cs="Calibri" w:eastAsia="Calibri" w:hAnsi="Calibri"/>
           <w:b/>
           <w:bCs/>
-          <w:sz w:val="22"/>
-          <w:szCs w:val="22"/>
+          <w:sz w:val="21"/>
+          <w:szCs w:val="21"/>
         </w:rPr>
         <w:t xml:space="preserve">FV = PV × (1+r)^t</w:t>
       </w:r>
       <w:r>
         <w:rPr>
           <w:rFonts w:ascii="Calibri" w:cs="Calibri" w:eastAsia="Calibri" w:hAnsi="Calibri"/>
-          <w:sz w:val="22"/>
-          <w:szCs w:val="22"/>
+          <w:sz w:val="21"/>
+          <w:szCs w:val="21"/>
         </w:rPr>
         <w:t xml:space="preserve">. Compare offers at the </w:t>
       </w:r>
@@ -3723,16 +3819,16 @@
           <w:rFonts w:ascii="Calibri" w:cs="Calibri" w:eastAsia="Calibri" w:hAnsi="Calibri"/>
           <w:b/>
           <w:bCs/>
-          <w:sz w:val="22"/>
-          <w:szCs w:val="22"/>
+          <w:sz w:val="21"/>
+          <w:szCs w:val="21"/>
         </w:rPr>
         <w:t xml:space="preserve">same date</w:t>
       </w:r>
       <w:r>
         <w:rPr>
           <w:rFonts w:ascii="Calibri" w:cs="Calibri" w:eastAsia="Calibri" w:hAnsi="Calibri"/>
-          <w:sz w:val="22"/>
-          <w:szCs w:val="22"/>
+          <w:sz w:val="21"/>
+          <w:szCs w:val="21"/>
         </w:rPr>
         <w:t xml:space="preserve">; bigger PV wins.</w:t>
       </w:r>
@@ -3744,8 +3840,8 @@
       <w:r>
         <w:rPr>
           <w:rFonts w:ascii="Calibri" w:cs="Calibri" w:eastAsia="Calibri" w:hAnsi="Calibri"/>
-          <w:sz w:val="22"/>
-          <w:szCs w:val="22"/>
+          <w:sz w:val="21"/>
+          <w:szCs w:val="21"/>
         </w:rPr>
         <w:t xml:space="preserve">Annuity (same C at t = 1…N): PV = C/r × (1 – 1/(1+r)^N)</w:t>
       </w:r>
@@ -3757,8 +3853,8 @@
       <w:r>
         <w:rPr>
           <w:rFonts w:ascii="Calibri" w:cs="Calibri" w:eastAsia="Calibri" w:hAnsi="Calibri"/>
-          <w:sz w:val="22"/>
-          <w:szCs w:val="22"/>
+          <w:sz w:val="21"/>
+          <w:szCs w:val="21"/>
         </w:rPr>
         <w:t xml:space="preserve">Growing annuity: PV = C₁/(r – g) × (1 – ((1+g)/(1+r))^N)</w:t>
       </w:r>
@@ -3770,8 +3866,8 @@
       <w:r>
         <w:rPr>
           <w:rFonts w:ascii="Calibri" w:cs="Calibri" w:eastAsia="Calibri" w:hAnsi="Calibri"/>
-          <w:sz w:val="22"/>
-          <w:szCs w:val="22"/>
+          <w:sz w:val="21"/>
+          <w:szCs w:val="21"/>
         </w:rPr>
         <w:t xml:space="preserve">Perpetuity C/r. Growing perpetuity C₁/(r – g). First payment today (annuity due): multiply PV by (1+r).</w:t>
       </w:r>
@@ -3785,16 +3881,16 @@
           <w:rFonts w:ascii="Calibri" w:cs="Calibri" w:eastAsia="Calibri" w:hAnsi="Calibri"/>
           <w:b/>
           <w:bCs/>
-          <w:sz w:val="22"/>
-          <w:szCs w:val="22"/>
+          <w:sz w:val="21"/>
+          <w:szCs w:val="21"/>
         </w:rPr>
         <w:t xml:space="preserve">By hand (“dumb”):</w:t>
       </w:r>
       <w:r>
         <w:rPr>
           <w:rFonts w:ascii="Calibri" w:cs="Calibri" w:eastAsia="Calibri" w:hAnsi="Calibri"/>
-          <w:sz w:val="22"/>
-          <w:szCs w:val="22"/>
+          <w:sz w:val="21"/>
+          <w:szCs w:val="21"/>
         </w:rPr>
         <w:t xml:space="preserve"> row 1 = years 0…N; row 2 = cash flows; row 3 = </w:t>
       </w:r>
@@ -3804,16 +3900,16 @@
           <w:b/>
           <w:bCs/>
           <w:color w:val="1F4E79"/>
-          <w:sz w:val="22"/>
-          <w:szCs w:val="22"/>
+          <w:sz w:val="21"/>
+          <w:szCs w:val="21"/>
         </w:rPr>
         <w:t xml:space="preserve">=1/(1+$B$1)^C5</w:t>
       </w:r>
       <w:r>
         <w:rPr>
           <w:rFonts w:ascii="Calibri" w:cs="Calibri" w:eastAsia="Calibri" w:hAnsi="Calibri"/>
-          <w:sz w:val="22"/>
-          <w:szCs w:val="22"/>
+          <w:sz w:val="21"/>
+          <w:szCs w:val="21"/>
         </w:rPr>
         <w:t xml:space="preserve"> (discount factor); row 4 = CF × factor; PV = </w:t>
       </w:r>
@@ -3823,16 +3919,16 @@
           <w:b/>
           <w:bCs/>
           <w:color w:val="1F4E79"/>
-          <w:sz w:val="22"/>
-          <w:szCs w:val="22"/>
+          <w:sz w:val="21"/>
+          <w:szCs w:val="21"/>
         </w:rPr>
         <w:t xml:space="preserve">=SUM(row 4)</w:t>
       </w:r>
       <w:r>
         <w:rPr>
           <w:rFonts w:ascii="Calibri" w:cs="Calibri" w:eastAsia="Calibri" w:hAnsi="Calibri"/>
-          <w:sz w:val="22"/>
-          <w:szCs w:val="22"/>
+          <w:sz w:val="21"/>
+          <w:szCs w:val="21"/>
         </w:rPr>
         <w:t xml:space="preserve">. Value at year T = PV × (1+r)^T.</w:t>
       </w:r>
@@ -3881,8 +3977,8 @@
                 <w:b/>
                 <w:bCs/>
                 <w:color w:val="1F4E79"/>
-                <w:sz w:val="22"/>
-                <w:szCs w:val="22"/>
+                <w:sz w:val="21"/>
+                <w:szCs w:val="21"/>
               </w:rPr>
               <w:t xml:space="preserve">=PV(r,n,-C)</w:t>
             </w:r>
@@ -3908,8 +4004,8 @@
             <w:r>
               <w:rPr>
                 <w:rFonts w:ascii="Calibri" w:cs="Calibri" w:eastAsia="Calibri" w:hAnsi="Calibri"/>
-                <w:sz w:val="22"/>
-                <w:szCs w:val="22"/>
+                <w:sz w:val="21"/>
+                <w:szCs w:val="21"/>
               </w:rPr>
               <w:t xml:space="preserve">Today’s value of n payments of C</w:t>
             </w:r>
@@ -3944,8 +4040,8 @@
                 <w:b/>
                 <w:bCs/>
                 <w:color w:val="1F4E79"/>
-                <w:sz w:val="22"/>
-                <w:szCs w:val="22"/>
+                <w:sz w:val="21"/>
+                <w:szCs w:val="21"/>
               </w:rPr>
               <w:t xml:space="preserve">=FV(r,n,-C)</w:t>
             </w:r>
@@ -3971,8 +4067,8 @@
             <w:r>
               <w:rPr>
                 <w:rFonts w:ascii="Calibri" w:cs="Calibri" w:eastAsia="Calibri" w:hAnsi="Calibri"/>
-                <w:sz w:val="22"/>
-                <w:szCs w:val="22"/>
+                <w:sz w:val="21"/>
+                <w:szCs w:val="21"/>
               </w:rPr>
               <w:t xml:space="preserve">Value at year n</w:t>
             </w:r>
@@ -4007,8 +4103,8 @@
                 <w:b/>
                 <w:bCs/>
                 <w:color w:val="1F4E79"/>
-                <w:sz w:val="22"/>
-                <w:szCs w:val="22"/>
+                <w:sz w:val="21"/>
+                <w:szCs w:val="21"/>
               </w:rPr>
               <w:t xml:space="preserve">=PMT(r,n,-PV)</w:t>
             </w:r>
@@ -4034,8 +4130,8 @@
             <w:r>
               <w:rPr>
                 <w:rFonts w:ascii="Calibri" w:cs="Calibri" w:eastAsia="Calibri" w:hAnsi="Calibri"/>
-                <w:sz w:val="22"/>
-                <w:szCs w:val="22"/>
+                <w:sz w:val="21"/>
+                <w:szCs w:val="21"/>
               </w:rPr>
               <w:t xml:space="preserve">Payment that pays off PV</w:t>
             </w:r>
@@ -4070,8 +4166,8 @@
                 <w:b/>
                 <w:bCs/>
                 <w:color w:val="1F4E79"/>
-                <w:sz w:val="22"/>
-                <w:szCs w:val="22"/>
+                <w:sz w:val="21"/>
+                <w:szCs w:val="21"/>
               </w:rPr>
               <w:t xml:space="preserve">=RATE(n,C,-PV)</w:t>
             </w:r>
@@ -4097,8 +4193,8 @@
             <w:r>
               <w:rPr>
                 <w:rFonts w:ascii="Calibri" w:cs="Calibri" w:eastAsia="Calibri" w:hAnsi="Calibri"/>
-                <w:sz w:val="22"/>
-                <w:szCs w:val="22"/>
+                <w:sz w:val="21"/>
+                <w:szCs w:val="21"/>
               </w:rPr>
               <w:t xml:space="preserve">Discount rate implied by the deal</w:t>
             </w:r>
@@ -4133,8 +4229,8 @@
                 <w:b/>
                 <w:bCs/>
                 <w:color w:val="1F4E79"/>
-                <w:sz w:val="22"/>
-                <w:szCs w:val="22"/>
+                <w:sz w:val="21"/>
+                <w:szCs w:val="21"/>
               </w:rPr>
               <w:t xml:space="preserve">=NPER(r,C,-PV)</w:t>
             </w:r>
@@ -4160,8 +4256,8 @@
             <w:r>
               <w:rPr>
                 <w:rFonts w:ascii="Calibri" w:cs="Calibri" w:eastAsia="Calibri" w:hAnsi="Calibri"/>
-                <w:sz w:val="22"/>
-                <w:szCs w:val="22"/>
+                <w:sz w:val="21"/>
+                <w:szCs w:val="21"/>
               </w:rPr>
               <w:t xml:space="preserve">Number of payments</w:t>
             </w:r>
@@ -4196,8 +4292,8 @@
                 <w:b/>
                 <w:bCs/>
                 <w:color w:val="1F4E79"/>
-                <w:sz w:val="22"/>
-                <w:szCs w:val="22"/>
+                <w:sz w:val="21"/>
+                <w:szCs w:val="21"/>
               </w:rPr>
               <w:t xml:space="preserve">=NPV(r,C1:Cn)</w:t>
             </w:r>
@@ -4223,8 +4319,8 @@
             <w:r>
               <w:rPr>
                 <w:rFonts w:ascii="Calibri" w:cs="Calibri" w:eastAsia="Calibri" w:hAnsi="Calibri"/>
-                <w:sz w:val="22"/>
-                <w:szCs w:val="22"/>
+                <w:sz w:val="21"/>
+                <w:szCs w:val="21"/>
               </w:rPr>
               <w:t xml:space="preserve">Starts at t = 1! Add CF0 yourself</w:t>
             </w:r>
@@ -4259,8 +4355,8 @@
                 <w:b/>
                 <w:bCs/>
                 <w:color w:val="1F4E79"/>
-                <w:sz w:val="22"/>
-                <w:szCs w:val="22"/>
+                <w:sz w:val="21"/>
+                <w:szCs w:val="21"/>
               </w:rPr>
               <w:t xml:space="preserve">=IRR(C0:Cn)</w:t>
             </w:r>
@@ -4286,8 +4382,8 @@
             <w:r>
               <w:rPr>
                 <w:rFonts w:ascii="Calibri" w:cs="Calibri" w:eastAsia="Calibri" w:hAnsi="Calibri"/>
-                <w:sz w:val="22"/>
-                <w:szCs w:val="22"/>
+                <w:sz w:val="21"/>
+                <w:szCs w:val="21"/>
               </w:rPr>
               <w:t xml:space="preserve">Rate where NPV = 0 (C0 negative)</w:t>
             </w:r>
@@ -4302,8 +4398,8 @@
       <w:r>
         <w:rPr>
           <w:rFonts w:ascii="Calibri" w:cs="Calibri" w:eastAsia="Calibri" w:hAnsi="Calibri"/>
-          <w:sz w:val="22"/>
-          <w:szCs w:val="22"/>
+          <w:sz w:val="21"/>
+          <w:szCs w:val="21"/>
         </w:rPr>
         <w:t xml:space="preserve">Minus signs: Excel needs money paid and money received to have opposite signs. Payments start today? Add </w:t>
       </w:r>
@@ -4313,16 +4409,16 @@
           <w:b/>
           <w:bCs/>
           <w:color w:val="1F4E79"/>
-          <w:sz w:val="22"/>
-          <w:szCs w:val="22"/>
+          <w:sz w:val="21"/>
+          <w:szCs w:val="21"/>
         </w:rPr>
         <w:t xml:space="preserve">,0,1</w:t>
       </w:r>
       <w:r>
         <w:rPr>
           <w:rFonts w:ascii="Calibri" w:cs="Calibri" w:eastAsia="Calibri" w:hAnsi="Calibri"/>
-          <w:sz w:val="22"/>
-          <w:szCs w:val="22"/>
+          <w:sz w:val="21"/>
+          <w:szCs w:val="21"/>
         </w:rPr>
         <w:t xml:space="preserve"> at the end: </w:t>
       </w:r>
@@ -4332,16 +4428,16 @@
           <w:b/>
           <w:bCs/>
           <w:color w:val="1F4E79"/>
-          <w:sz w:val="22"/>
-          <w:szCs w:val="22"/>
+          <w:sz w:val="21"/>
+          <w:szCs w:val="21"/>
         </w:rPr>
         <w:t xml:space="preserve">=PV(r,n,-C,0,1)</w:t>
       </w:r>
       <w:r>
         <w:rPr>
           <w:rFonts w:ascii="Calibri" w:cs="Calibri" w:eastAsia="Calibri" w:hAnsi="Calibri"/>
-          <w:sz w:val="22"/>
-          <w:szCs w:val="22"/>
+          <w:sz w:val="21"/>
+          <w:szCs w:val="21"/>
         </w:rPr>
         <w:t xml:space="preserve">.</w:t>
       </w:r>
@@ -4358,8 +4454,8 @@
           <w:b/>
           <w:bCs/>
           <w:color w:val="FFFFFF"/>
-          <w:sz w:val="22"/>
-          <w:szCs w:val="22"/>
+          <w:sz w:val="21"/>
+          <w:szCs w:val="21"/>
         </w:rPr>
         <w:t xml:space="preserve">INTEREST RATES &amp; LOANS</w:t>
       </w:r>
@@ -4371,8 +4467,8 @@
       <w:r>
         <w:rPr>
           <w:rFonts w:ascii="Calibri" w:cs="Calibri" w:eastAsia="Calibri" w:hAnsi="Calibri"/>
-          <w:sz w:val="22"/>
-          <w:szCs w:val="22"/>
+          <w:sz w:val="21"/>
+          <w:szCs w:val="21"/>
         </w:rPr>
         <w:t xml:space="preserve">APR = quoted annual rate. Per-period rate = APR / periods per year.</w:t>
       </w:r>
@@ -4386,16 +4482,16 @@
           <w:rFonts w:ascii="Calibri" w:cs="Calibri" w:eastAsia="Calibri" w:hAnsi="Calibri"/>
           <w:b/>
           <w:bCs/>
-          <w:sz w:val="22"/>
-          <w:szCs w:val="22"/>
+          <w:sz w:val="21"/>
+          <w:szCs w:val="21"/>
         </w:rPr>
         <w:t xml:space="preserve">EAR = (1 + APR/k)^k – 1</w:t>
       </w:r>
       <w:r>
         <w:rPr>
           <w:rFonts w:ascii="Calibri" w:cs="Calibri" w:eastAsia="Calibri" w:hAnsi="Calibri"/>
-          <w:sz w:val="22"/>
-          <w:szCs w:val="22"/>
+          <w:sz w:val="21"/>
+          <w:szCs w:val="21"/>
         </w:rPr>
         <w:t xml:space="preserve"> = </w:t>
       </w:r>
@@ -4405,16 +4501,16 @@
           <w:b/>
           <w:bCs/>
           <w:color w:val="1F4E79"/>
-          <w:sz w:val="22"/>
-          <w:szCs w:val="22"/>
+          <w:sz w:val="21"/>
+          <w:szCs w:val="21"/>
         </w:rPr>
         <w:t xml:space="preserve">=EFFECT(APR,k)</w:t>
       </w:r>
       <w:r>
         <w:rPr>
           <w:rFonts w:ascii="Calibri" w:cs="Calibri" w:eastAsia="Calibri" w:hAnsi="Calibri"/>
-          <w:sz w:val="22"/>
-          <w:szCs w:val="22"/>
+          <w:sz w:val="21"/>
+          <w:szCs w:val="21"/>
         </w:rPr>
         <w:t xml:space="preserve">. Bond EAY = (1 + y/2)^2 – 1.</w:t>
       </w:r>
@@ -4426,8 +4522,8 @@
       <w:r>
         <w:rPr>
           <w:rFonts w:ascii="Calibri" w:cs="Calibri" w:eastAsia="Calibri" w:hAnsi="Calibri"/>
-          <w:sz w:val="22"/>
-          <w:szCs w:val="22"/>
+          <w:sz w:val="21"/>
+          <w:szCs w:val="21"/>
         </w:rPr>
         <w:t xml:space="preserve">Monthly loan payment: </w:t>
       </w:r>
@@ -4437,16 +4533,16 @@
           <w:b/>
           <w:bCs/>
           <w:color w:val="1F4E79"/>
-          <w:sz w:val="22"/>
-          <w:szCs w:val="22"/>
+          <w:sz w:val="21"/>
+          <w:szCs w:val="21"/>
         </w:rPr>
         <w:t xml:space="preserve">=PMT(APR/12,years*12,-loan)</w:t>
       </w:r>
       <w:r>
         <w:rPr>
           <w:rFonts w:ascii="Calibri" w:cs="Calibri" w:eastAsia="Calibri" w:hAnsi="Calibri"/>
-          <w:sz w:val="22"/>
-          <w:szCs w:val="22"/>
+          <w:sz w:val="21"/>
+          <w:szCs w:val="21"/>
         </w:rPr>
         <w:t xml:space="preserve">. Balance after k payments: </w:t>
       </w:r>
@@ -4456,16 +4552,16 @@
           <w:b/>
           <w:bCs/>
           <w:color w:val="1F4E79"/>
-          <w:sz w:val="22"/>
-          <w:szCs w:val="22"/>
+          <w:sz w:val="21"/>
+          <w:szCs w:val="21"/>
         </w:rPr>
         <w:t xml:space="preserve">=PV(APR/12,N-k,-payment)</w:t>
       </w:r>
       <w:r>
         <w:rPr>
           <w:rFonts w:ascii="Calibri" w:cs="Calibri" w:eastAsia="Calibri" w:hAnsi="Calibri"/>
-          <w:sz w:val="22"/>
-          <w:szCs w:val="22"/>
+          <w:sz w:val="21"/>
+          <w:szCs w:val="21"/>
         </w:rPr>
         <w:t xml:space="preserve">.</w:t>
       </w:r>
@@ -4479,16 +4575,16 @@
           <w:rFonts w:ascii="Calibri" w:cs="Calibri" w:eastAsia="Calibri" w:hAnsi="Calibri"/>
           <w:b/>
           <w:bCs/>
-          <w:sz w:val="22"/>
-          <w:szCs w:val="22"/>
+          <w:sz w:val="21"/>
+          <w:szCs w:val="21"/>
         </w:rPr>
         <w:t xml:space="preserve">Restructuring:</w:t>
       </w:r>
       <w:r>
         <w:rPr>
           <w:rFonts w:ascii="Calibri" w:cs="Calibri" w:eastAsia="Calibri" w:hAnsi="Calibri"/>
-          <w:sz w:val="22"/>
-          <w:szCs w:val="22"/>
+          <w:sz w:val="21"/>
+          <w:szCs w:val="21"/>
         </w:rPr>
         <w:t xml:space="preserve"> the new deal must have the same PV at the same rate. Solve for the unknown with PMT / RATE / NPER.</w:t>
       </w:r>
@@ -4505,8 +4601,8 @@
           <w:b/>
           <w:bCs/>
           <w:color w:val="FFFFFF"/>
-          <w:sz w:val="22"/>
-          <w:szCs w:val="22"/>
+          <w:sz w:val="21"/>
+          <w:szCs w:val="21"/>
         </w:rPr>
         <w:t xml:space="preserve">BOND WORDS</w:t>
       </w:r>
@@ -4520,16 +4616,16 @@
           <w:rFonts w:ascii="Calibri" w:cs="Calibri" w:eastAsia="Calibri" w:hAnsi="Calibri"/>
           <w:b/>
           <w:bCs/>
-          <w:sz w:val="22"/>
-          <w:szCs w:val="22"/>
+          <w:sz w:val="21"/>
+          <w:szCs w:val="21"/>
         </w:rPr>
         <w:t xml:space="preserve">Par (face) = 100</w:t>
       </w:r>
       <w:r>
         <w:rPr>
           <w:rFonts w:ascii="Calibri" w:cs="Calibri" w:eastAsia="Calibri" w:hAnsi="Calibri"/>
-          <w:sz w:val="22"/>
-          <w:szCs w:val="22"/>
+          <w:sz w:val="21"/>
+          <w:szCs w:val="21"/>
         </w:rPr>
         <w:t xml:space="preserve">, repaid at maturity. </w:t>
       </w:r>
@@ -4538,16 +4634,16 @@
           <w:rFonts w:ascii="Calibri" w:cs="Calibri" w:eastAsia="Calibri" w:hAnsi="Calibri"/>
           <w:b/>
           <w:bCs/>
-          <w:sz w:val="22"/>
-          <w:szCs w:val="22"/>
+          <w:sz w:val="21"/>
+          <w:szCs w:val="21"/>
         </w:rPr>
         <w:t xml:space="preserve">Coupon rate</w:t>
       </w:r>
       <w:r>
         <w:rPr>
           <w:rFonts w:ascii="Calibri" w:cs="Calibri" w:eastAsia="Calibri" w:hAnsi="Calibri"/>
-          <w:sz w:val="22"/>
-          <w:szCs w:val="22"/>
+          <w:sz w:val="21"/>
+          <w:szCs w:val="21"/>
         </w:rPr>
         <w:t xml:space="preserve"> = % of par paid per year, in 2 halves (5% → 2.50 every 6 months).</w:t>
       </w:r>
@@ -4561,16 +4657,16 @@
           <w:rFonts w:ascii="Calibri" w:cs="Calibri" w:eastAsia="Calibri" w:hAnsi="Calibri"/>
           <w:b/>
           <w:bCs/>
-          <w:sz w:val="22"/>
-          <w:szCs w:val="22"/>
+          <w:sz w:val="21"/>
+          <w:szCs w:val="21"/>
         </w:rPr>
         <w:t xml:space="preserve">Yield (YTM)</w:t>
       </w:r>
       <w:r>
         <w:rPr>
           <w:rFonts w:ascii="Calibri" w:cs="Calibri" w:eastAsia="Calibri" w:hAnsi="Calibri"/>
-          <w:sz w:val="22"/>
-          <w:szCs w:val="22"/>
+          <w:sz w:val="21"/>
+          <w:szCs w:val="21"/>
         </w:rPr>
         <w:t xml:space="preserve"> = discount rate that makes PV of the bond’s cash = price. Quoted as APR; use y/2 per half-year.</w:t>
       </w:r>
@@ -4582,8 +4678,8 @@
       <w:r>
         <w:rPr>
           <w:rFonts w:ascii="Calibri" w:cs="Calibri" w:eastAsia="Calibri" w:hAnsi="Calibri"/>
-          <w:sz w:val="22"/>
-          <w:szCs w:val="22"/>
+          <w:sz w:val="21"/>
+          <w:szCs w:val="21"/>
         </w:rPr>
         <w:t xml:space="preserve">Yield ↑ ⇒ price ↓. Coupon &gt; yield ⇒ price &gt; 100. Issued at par ⇒ coupon = yield.</w:t>
       </w:r>
@@ -4597,16 +4693,16 @@
           <w:rFonts w:ascii="Calibri" w:cs="Calibri" w:eastAsia="Calibri" w:hAnsi="Calibri"/>
           <w:b/>
           <w:bCs/>
-          <w:sz w:val="22"/>
-          <w:szCs w:val="22"/>
+          <w:sz w:val="21"/>
+          <w:szCs w:val="21"/>
         </w:rPr>
         <w:t xml:space="preserve">Corporate yield = Treasury yield + spread.</w:t>
       </w:r>
       <w:r>
         <w:rPr>
           <w:rFonts w:ascii="Calibri" w:cs="Calibri" w:eastAsia="Calibri" w:hAnsi="Calibri"/>
-          <w:sz w:val="22"/>
-          <w:szCs w:val="22"/>
+          <w:sz w:val="21"/>
+          <w:szCs w:val="21"/>
         </w:rPr>
         <w:t xml:space="preserve"> 1 bp = 0.01% = 0.0001.</w:t>
       </w:r>
@@ -4620,16 +4716,16 @@
           <w:rFonts w:ascii="Calibri" w:cs="Calibri" w:eastAsia="Calibri" w:hAnsi="Calibri"/>
           <w:b/>
           <w:bCs/>
-          <w:sz w:val="22"/>
-          <w:szCs w:val="22"/>
+          <w:sz w:val="21"/>
+          <w:szCs w:val="21"/>
         </w:rPr>
         <w:t xml:space="preserve">Basis:</w:t>
       </w:r>
       <w:r>
         <w:rPr>
           <w:rFonts w:ascii="Calibri" w:cs="Calibri" w:eastAsia="Calibri" w:hAnsi="Calibri"/>
-          <w:sz w:val="22"/>
-          <w:szCs w:val="22"/>
+          <w:sz w:val="21"/>
+          <w:szCs w:val="21"/>
         </w:rPr>
         <w:t xml:space="preserve"> 0 = 30/360 (corporates), 1 = actual/actual (Treasuries). Settlement = date you buy.</w:t>
       </w:r>
@@ -4646,8 +4742,8 @@
           <w:b/>
           <w:bCs/>
           <w:color w:val="FFFFFF"/>
-          <w:sz w:val="22"/>
-          <w:szCs w:val="22"/>
+          <w:sz w:val="21"/>
+          <w:szCs w:val="21"/>
         </w:rPr>
         <w:t xml:space="preserve">BONDS WITHOUT DATES (“dumb”)</w:t>
       </w:r>
@@ -4693,8 +4789,8 @@
             <w:r>
               <w:rPr>
                 <w:rFonts w:ascii="Calibri" w:cs="Calibri" w:eastAsia="Calibri" w:hAnsi="Calibri"/>
-                <w:sz w:val="22"/>
-                <w:szCs w:val="22"/>
+                <w:sz w:val="21"/>
+                <w:szCs w:val="21"/>
               </w:rPr>
               <w:t xml:space="preserve">Price</w:t>
             </w:r>
@@ -4723,8 +4819,8 @@
                 <w:b/>
                 <w:bCs/>
                 <w:color w:val="1F4E79"/>
-                <w:sz w:val="22"/>
-                <w:szCs w:val="22"/>
+                <w:sz w:val="21"/>
+                <w:szCs w:val="21"/>
               </w:rPr>
               <w:t xml:space="preserve">=PV(yield/2,2*years,-coupon*100/2,-100)</w:t>
             </w:r>
@@ -4756,8 +4852,8 @@
             <w:r>
               <w:rPr>
                 <w:rFonts w:ascii="Calibri" w:cs="Calibri" w:eastAsia="Calibri" w:hAnsi="Calibri"/>
-                <w:sz w:val="22"/>
-                <w:szCs w:val="22"/>
+                <w:sz w:val="21"/>
+                <w:szCs w:val="21"/>
               </w:rPr>
               <w:t xml:space="preserve">YTM</w:t>
             </w:r>
@@ -4786,8 +4882,8 @@
                 <w:b/>
                 <w:bCs/>
                 <w:color w:val="1F4E79"/>
-                <w:sz w:val="22"/>
-                <w:szCs w:val="22"/>
+                <w:sz w:val="21"/>
+                <w:szCs w:val="21"/>
               </w:rPr>
               <w:t xml:space="preserve">=2*RATE(2*years,coupon*100/2,-price,100)</w:t>
             </w:r>
@@ -4819,8 +4915,8 @@
             <w:r>
               <w:rPr>
                 <w:rFonts w:ascii="Calibri" w:cs="Calibri" w:eastAsia="Calibri" w:hAnsi="Calibri"/>
-                <w:sz w:val="22"/>
-                <w:szCs w:val="22"/>
+                <w:sz w:val="21"/>
+                <w:szCs w:val="21"/>
               </w:rPr>
               <w:t xml:space="preserve">EAY</w:t>
             </w:r>
@@ -4849,8 +4945,8 @@
                 <w:b/>
                 <w:bCs/>
                 <w:color w:val="1F4E79"/>
-                <w:sz w:val="22"/>
-                <w:szCs w:val="22"/>
+                <w:sz w:val="21"/>
+                <w:szCs w:val="21"/>
               </w:rPr>
               <w:t xml:space="preserve">=(1+yield/2)^2-1</w:t>
             </w:r>
@@ -4882,8 +4978,8 @@
             <w:r>
               <w:rPr>
                 <w:rFonts w:ascii="Calibri" w:cs="Calibri" w:eastAsia="Calibri" w:hAnsi="Calibri"/>
-                <w:sz w:val="22"/>
-                <w:szCs w:val="22"/>
+                <w:sz w:val="21"/>
+                <w:szCs w:val="21"/>
               </w:rPr>
               <w:t xml:space="preserve">Coupon rate</w:t>
             </w:r>
@@ -4912,8 +5008,8 @@
                 <w:b/>
                 <w:bCs/>
                 <w:color w:val="1F4E79"/>
-                <w:sz w:val="22"/>
-                <w:szCs w:val="22"/>
+                <w:sz w:val="21"/>
+                <w:szCs w:val="21"/>
               </w:rPr>
               <w:t xml:space="preserve">=2*PMT(yield/2,2*years,-price,100)/100</w:t>
             </w:r>
@@ -4928,8 +5024,8 @@
       <w:r>
         <w:rPr>
           <w:rFonts w:ascii="Calibri" w:cs="Calibri" w:eastAsia="Calibri" w:hAnsi="Calibri"/>
-          <w:sz w:val="22"/>
-          <w:szCs w:val="22"/>
+          <w:sz w:val="21"/>
+          <w:szCs w:val="21"/>
         </w:rPr>
         <w:t xml:space="preserve">Price needs the yield. YTM needs the price (per 100, e.g. 87.91). EAY needs only the YTM. years = years LEFT.</w:t>
       </w:r>
@@ -4943,16 +5039,16 @@
           <w:rFonts w:ascii="Calibri" w:cs="Calibri" w:eastAsia="Calibri" w:hAnsi="Calibri"/>
           <w:b/>
           <w:bCs/>
-          <w:sz w:val="22"/>
-          <w:szCs w:val="22"/>
+          <w:sz w:val="21"/>
+          <w:szCs w:val="21"/>
         </w:rPr>
         <w:t xml:space="preserve">Bond exchange:</w:t>
       </w:r>
       <w:r>
         <w:rPr>
           <w:rFonts w:ascii="Calibri" w:cs="Calibri" w:eastAsia="Calibri" w:hAnsi="Calibri"/>
-          <w:sz w:val="22"/>
-          <w:szCs w:val="22"/>
+          <w:sz w:val="21"/>
+          <w:szCs w:val="21"/>
         </w:rPr>
         <w:t xml:space="preserve"> the new bond must be worth what the old one is worth. Solve for the new coupon with PMT. Face needed to raise $X = X / (price/100).</w:t>
       </w:r>
@@ -4969,8 +5065,8 @@
           <w:b/>
           <w:bCs/>
           <w:color w:val="FFFFFF"/>
-          <w:sz w:val="22"/>
-          <w:szCs w:val="22"/>
+          <w:sz w:val="21"/>
+          <w:szCs w:val="21"/>
         </w:rPr>
         <w:t xml:space="preserve">BONDS WITH DATES (“smart”), STEP BY STEP</w:t>
       </w:r>
@@ -4980,15 +5076,15 @@
         <w:pStyle w:val="ListParagraph"/>
         <w:numPr>
           <w:ilvl w:val="0"/>
-          <w:numId w:val="3"/>
+          <w:numId w:val="4"/>
         </w:numPr>
         <w:spacing w:after="0" w:before="0"/>
       </w:pPr>
       <w:r>
         <w:rPr>
           <w:rFonts w:ascii="Calibri" w:cs="Calibri" w:eastAsia="Calibri" w:hAnsi="Calibri"/>
-          <w:sz w:val="22"/>
-          <w:szCs w:val="22"/>
+          <w:sz w:val="21"/>
+          <w:szCs w:val="21"/>
         </w:rPr>
         <w:t xml:space="preserve">Type inputs: settle </w:t>
       </w:r>
@@ -4998,16 +5094,16 @@
           <w:b/>
           <w:bCs/>
           <w:color w:val="1F4E79"/>
-          <w:sz w:val="22"/>
-          <w:szCs w:val="22"/>
+          <w:sz w:val="21"/>
+          <w:szCs w:val="21"/>
         </w:rPr>
         <w:t xml:space="preserve">=DATE(…)</w:t>
       </w:r>
       <w:r>
         <w:rPr>
           <w:rFonts w:ascii="Calibri" w:cs="Calibri" w:eastAsia="Calibri" w:hAnsi="Calibri"/>
-          <w:sz w:val="22"/>
-          <w:szCs w:val="22"/>
+          <w:sz w:val="21"/>
+          <w:szCs w:val="21"/>
         </w:rPr>
         <w:t xml:space="preserve">, maturity </w:t>
       </w:r>
@@ -5017,16 +5113,16 @@
           <w:b/>
           <w:bCs/>
           <w:color w:val="1F4E79"/>
-          <w:sz w:val="22"/>
-          <w:szCs w:val="22"/>
+          <w:sz w:val="21"/>
+          <w:szCs w:val="21"/>
         </w:rPr>
         <w:t xml:space="preserve">=DATE(…)</w:t>
       </w:r>
       <w:r>
         <w:rPr>
           <w:rFonts w:ascii="Calibri" w:cs="Calibri" w:eastAsia="Calibri" w:hAnsi="Calibri"/>
-          <w:sz w:val="22"/>
-          <w:szCs w:val="22"/>
+          <w:sz w:val="21"/>
+          <w:szCs w:val="21"/>
         </w:rPr>
         <w:t xml:space="preserve">, coupon, price or yield, 2, basis.</w:t>
       </w:r>
@@ -5036,15 +5132,15 @@
         <w:pStyle w:val="ListParagraph"/>
         <w:numPr>
           <w:ilvl w:val="0"/>
-          <w:numId w:val="3"/>
+          <w:numId w:val="4"/>
         </w:numPr>
         <w:spacing w:after="0" w:before="0"/>
       </w:pPr>
       <w:r>
         <w:rPr>
           <w:rFonts w:ascii="Calibri" w:cs="Calibri" w:eastAsia="Calibri" w:hAnsi="Calibri"/>
-          <w:sz w:val="22"/>
-          <w:szCs w:val="22"/>
+          <w:sz w:val="21"/>
+          <w:szCs w:val="21"/>
         </w:rPr>
         <w:t xml:space="preserve">Treasury yield: </w:t>
       </w:r>
@@ -5054,8 +5150,8 @@
           <w:b/>
           <w:bCs/>
           <w:color w:val="1F4E79"/>
-          <w:sz w:val="22"/>
-          <w:szCs w:val="22"/>
+          <w:sz w:val="21"/>
+          <w:szCs w:val="21"/>
         </w:rPr>
         <w:t xml:space="preserve">=YIELD(settle,mat,coupon,price,100,2,1)</w:t>
       </w:r>
@@ -5065,15 +5161,15 @@
         <w:pStyle w:val="ListParagraph"/>
         <w:numPr>
           <w:ilvl w:val="0"/>
-          <w:numId w:val="3"/>
+          <w:numId w:val="4"/>
         </w:numPr>
         <w:spacing w:after="0" w:before="0"/>
       </w:pPr>
       <w:r>
         <w:rPr>
           <w:rFonts w:ascii="Calibri" w:cs="Calibri" w:eastAsia="Calibri" w:hAnsi="Calibri"/>
-          <w:sz w:val="22"/>
-          <w:szCs w:val="22"/>
+          <w:sz w:val="21"/>
+          <w:szCs w:val="21"/>
         </w:rPr>
         <w:t xml:space="preserve">Corporate yield = Treasury yield + spread.</w:t>
       </w:r>
@@ -5083,15 +5179,15 @@
         <w:pStyle w:val="ListParagraph"/>
         <w:numPr>
           <w:ilvl w:val="0"/>
-          <w:numId w:val="3"/>
+          <w:numId w:val="4"/>
         </w:numPr>
         <w:spacing w:after="0" w:before="0"/>
       </w:pPr>
       <w:r>
         <w:rPr>
           <w:rFonts w:ascii="Calibri" w:cs="Calibri" w:eastAsia="Calibri" w:hAnsi="Calibri"/>
-          <w:sz w:val="22"/>
-          <w:szCs w:val="22"/>
+          <w:sz w:val="21"/>
+          <w:szCs w:val="21"/>
         </w:rPr>
         <w:t xml:space="preserve">Clean price: </w:t>
       </w:r>
@@ -5101,8 +5197,8 @@
           <w:b/>
           <w:bCs/>
           <w:color w:val="1F4E79"/>
-          <w:sz w:val="22"/>
-          <w:szCs w:val="22"/>
+          <w:sz w:val="21"/>
+          <w:szCs w:val="21"/>
         </w:rPr>
         <w:t xml:space="preserve">=PRICE(settle,mat,coupon,yield,100,2,0)</w:t>
       </w:r>
@@ -5112,15 +5208,15 @@
         <w:pStyle w:val="ListParagraph"/>
         <w:numPr>
           <w:ilvl w:val="0"/>
-          <w:numId w:val="3"/>
+          <w:numId w:val="4"/>
         </w:numPr>
         <w:spacing w:after="0" w:before="0"/>
       </w:pPr>
       <w:r>
         <w:rPr>
           <w:rFonts w:ascii="Calibri" w:cs="Calibri" w:eastAsia="Calibri" w:hAnsi="Calibri"/>
-          <w:sz w:val="22"/>
-          <w:szCs w:val="22"/>
+          <w:sz w:val="21"/>
+          <w:szCs w:val="21"/>
         </w:rPr>
         <w:t xml:space="preserve">Days since last coupon </w:t>
       </w:r>
@@ -5130,16 +5226,16 @@
           <w:b/>
           <w:bCs/>
           <w:color w:val="1F4E79"/>
-          <w:sz w:val="22"/>
-          <w:szCs w:val="22"/>
+          <w:sz w:val="21"/>
+          <w:szCs w:val="21"/>
         </w:rPr>
         <w:t xml:space="preserve">=COUPDAYBS(settle,mat,2,0)</w:t>
       </w:r>
       <w:r>
         <w:rPr>
           <w:rFonts w:ascii="Calibri" w:cs="Calibri" w:eastAsia="Calibri" w:hAnsi="Calibri"/>
-          <w:sz w:val="22"/>
-          <w:szCs w:val="22"/>
+          <w:sz w:val="21"/>
+          <w:szCs w:val="21"/>
         </w:rPr>
         <w:t xml:space="preserve">; days in period </w:t>
       </w:r>
@@ -5149,16 +5245,16 @@
           <w:b/>
           <w:bCs/>
           <w:color w:val="1F4E79"/>
-          <w:sz w:val="22"/>
-          <w:szCs w:val="22"/>
+          <w:sz w:val="21"/>
+          <w:szCs w:val="21"/>
         </w:rPr>
         <w:t xml:space="preserve">=COUPDAYS(settle,mat,2,0)</w:t>
       </w:r>
       <w:r>
         <w:rPr>
           <w:rFonts w:ascii="Calibri" w:cs="Calibri" w:eastAsia="Calibri" w:hAnsi="Calibri"/>
-          <w:sz w:val="22"/>
-          <w:szCs w:val="22"/>
+          <w:sz w:val="21"/>
+          <w:szCs w:val="21"/>
         </w:rPr>
         <w:t xml:space="preserve"> (180 on 30/360).</w:t>
       </w:r>
@@ -5168,7 +5264,7 @@
         <w:pStyle w:val="ListParagraph"/>
         <w:numPr>
           <w:ilvl w:val="0"/>
-          <w:numId w:val="3"/>
+          <w:numId w:val="4"/>
         </w:numPr>
         <w:spacing w:after="0" w:before="0"/>
       </w:pPr>
@@ -5177,16 +5273,16 @@
           <w:rFonts w:ascii="Calibri" w:cs="Calibri" w:eastAsia="Calibri" w:hAnsi="Calibri"/>
           <w:b/>
           <w:bCs/>
-          <w:sz w:val="22"/>
-          <w:szCs w:val="22"/>
+          <w:sz w:val="21"/>
+          <w:szCs w:val="21"/>
         </w:rPr>
         <w:t xml:space="preserve">Accrued interest</w:t>
       </w:r>
       <w:r>
         <w:rPr>
           <w:rFonts w:ascii="Calibri" w:cs="Calibri" w:eastAsia="Calibri" w:hAnsi="Calibri"/>
-          <w:sz w:val="22"/>
-          <w:szCs w:val="22"/>
+          <w:sz w:val="21"/>
+          <w:szCs w:val="21"/>
         </w:rPr>
         <w:t xml:space="preserve"> = coupon×100/2 × COUPDAYBS / COUPDAYS</w:t>
       </w:r>
@@ -5196,7 +5292,7 @@
         <w:pStyle w:val="ListParagraph"/>
         <w:numPr>
           <w:ilvl w:val="0"/>
-          <w:numId w:val="3"/>
+          <w:numId w:val="4"/>
         </w:numPr>
         <w:spacing w:after="0" w:before="0"/>
       </w:pPr>
@@ -5205,16 +5301,16 @@
           <w:rFonts w:ascii="Calibri" w:cs="Calibri" w:eastAsia="Calibri" w:hAnsi="Calibri"/>
           <w:b/>
           <w:bCs/>
-          <w:sz w:val="22"/>
-          <w:szCs w:val="22"/>
+          <w:sz w:val="21"/>
+          <w:szCs w:val="21"/>
         </w:rPr>
         <w:t xml:space="preserve">Dirty price = clean + accrued.</w:t>
       </w:r>
       <w:r>
         <w:rPr>
           <w:rFonts w:ascii="Calibri" w:cs="Calibri" w:eastAsia="Calibri" w:hAnsi="Calibri"/>
-          <w:sz w:val="22"/>
-          <w:szCs w:val="22"/>
+          <w:sz w:val="21"/>
+          <w:szCs w:val="21"/>
         </w:rPr>
         <w:t xml:space="preserve"> Dealer QUOTES clean; you PAY dirty.</w:t>
       </w:r>
@@ -5224,7 +5320,7 @@
         <w:pStyle w:val="ListParagraph"/>
         <w:numPr>
           <w:ilvl w:val="0"/>
-          <w:numId w:val="3"/>
+          <w:numId w:val="4"/>
         </w:numPr>
         <w:spacing w:after="0" w:before="0"/>
       </w:pPr>
@@ -5234,16 +5330,16 @@
           <w:b/>
           <w:bCs/>
           <w:color w:val="1F4E79"/>
-          <w:sz w:val="22"/>
-          <w:szCs w:val="22"/>
+          <w:sz w:val="21"/>
+          <w:szCs w:val="21"/>
         </w:rPr>
         <w:t xml:space="preserve">=DURATION(settle,mat,coupon,yield,2,basis)</w:t>
       </w:r>
       <w:r>
         <w:rPr>
           <w:rFonts w:ascii="Calibri" w:cs="Calibri" w:eastAsia="Calibri" w:hAnsi="Calibri"/>
-          <w:sz w:val="22"/>
-          <w:szCs w:val="22"/>
+          <w:sz w:val="21"/>
+          <w:szCs w:val="21"/>
         </w:rPr>
         <w:t xml:space="preserve"> and </w:t>
       </w:r>
@@ -5253,8 +5349,8 @@
           <w:b/>
           <w:bCs/>
           <w:color w:val="1F4E79"/>
-          <w:sz w:val="22"/>
-          <w:szCs w:val="22"/>
+          <w:sz w:val="21"/>
+          <w:szCs w:val="21"/>
         </w:rPr>
         <w:t xml:space="preserve">=MDURATION(…same…)</w:t>
       </w:r>
@@ -5264,15 +5360,15 @@
         <w:pStyle w:val="ListParagraph"/>
         <w:numPr>
           <w:ilvl w:val="0"/>
-          <w:numId w:val="3"/>
+          <w:numId w:val="4"/>
         </w:numPr>
         <w:spacing w:after="0" w:before="0"/>
       </w:pPr>
       <w:r>
         <w:rPr>
           <w:rFonts w:ascii="Calibri" w:cs="Calibri" w:eastAsia="Calibri" w:hAnsi="Calibri"/>
-          <w:sz w:val="22"/>
-          <w:szCs w:val="22"/>
+          <w:sz w:val="21"/>
+          <w:szCs w:val="21"/>
         </w:rPr>
         <w:t xml:space="preserve">% price change ≈ –MDURATION × Δyield (+100 bp = +0.01).</w:t>
       </w:r>
@@ -5282,15 +5378,15 @@
         <w:pStyle w:val="ListParagraph"/>
         <w:numPr>
           <w:ilvl w:val="0"/>
-          <w:numId w:val="3"/>
+          <w:numId w:val="4"/>
         </w:numPr>
         <w:spacing w:after="0" w:before="0"/>
       </w:pPr>
       <w:r>
         <w:rPr>
           <w:rFonts w:ascii="Calibri" w:cs="Calibri" w:eastAsia="Calibri" w:hAnsi="Calibri"/>
-          <w:sz w:val="22"/>
-          <w:szCs w:val="22"/>
+          <w:sz w:val="21"/>
+          <w:szCs w:val="21"/>
         </w:rPr>
         <w:t xml:space="preserve">Actual: PRICE at the new yield + same accrued, vs. old dirty price.</w:t>
       </w:r>
@@ -5302,8 +5398,8 @@
       <w:r>
         <w:rPr>
           <w:rFonts w:ascii="Calibri" w:cs="Calibri" w:eastAsia="Calibri" w:hAnsi="Calibri"/>
-          <w:sz w:val="22"/>
-          <w:szCs w:val="22"/>
+          <w:sz w:val="21"/>
+          <w:szCs w:val="21"/>
         </w:rPr>
         <w:t xml:space="preserve">Also: </w:t>
       </w:r>
@@ -5313,16 +5409,16 @@
           <w:b/>
           <w:bCs/>
           <w:color w:val="1F4E79"/>
-          <w:sz w:val="22"/>
-          <w:szCs w:val="22"/>
+          <w:sz w:val="21"/>
+          <w:szCs w:val="21"/>
         </w:rPr>
         <w:t xml:space="preserve">COUPPCD</w:t>
       </w:r>
       <w:r>
         <w:rPr>
           <w:rFonts w:ascii="Calibri" w:cs="Calibri" w:eastAsia="Calibri" w:hAnsi="Calibri"/>
-          <w:sz w:val="22"/>
-          <w:szCs w:val="22"/>
+          <w:sz w:val="21"/>
+          <w:szCs w:val="21"/>
         </w:rPr>
         <w:t xml:space="preserve"> / </w:t>
       </w:r>
@@ -5332,16 +5428,16 @@
           <w:b/>
           <w:bCs/>
           <w:color w:val="1F4E79"/>
-          <w:sz w:val="22"/>
-          <w:szCs w:val="22"/>
+          <w:sz w:val="21"/>
+          <w:szCs w:val="21"/>
         </w:rPr>
         <w:t xml:space="preserve">COUPNCD</w:t>
       </w:r>
       <w:r>
         <w:rPr>
           <w:rFonts w:ascii="Calibri" w:cs="Calibri" w:eastAsia="Calibri" w:hAnsi="Calibri"/>
-          <w:sz w:val="22"/>
-          <w:szCs w:val="22"/>
+          <w:sz w:val="21"/>
+          <w:szCs w:val="21"/>
         </w:rPr>
         <w:t xml:space="preserve"> = previous/next coupon date (format as date); </w:t>
       </w:r>
@@ -5351,16 +5447,16 @@
           <w:b/>
           <w:bCs/>
           <w:color w:val="1F4E79"/>
-          <w:sz w:val="22"/>
-          <w:szCs w:val="22"/>
+          <w:sz w:val="21"/>
+          <w:szCs w:val="21"/>
         </w:rPr>
         <w:t xml:space="preserve">COUPNUM</w:t>
       </w:r>
       <w:r>
         <w:rPr>
           <w:rFonts w:ascii="Calibri" w:cs="Calibri" w:eastAsia="Calibri" w:hAnsi="Calibri"/>
-          <w:sz w:val="22"/>
-          <w:szCs w:val="22"/>
+          <w:sz w:val="21"/>
+          <w:szCs w:val="21"/>
         </w:rPr>
         <w:t xml:space="preserve"> = coupons left.</w:t>
       </w:r>
@@ -5377,8 +5473,8 @@
           <w:b/>
           <w:bCs/>
           <w:color w:val="FFFFFF"/>
-          <w:sz w:val="22"/>
-          <w:szCs w:val="22"/>
+          <w:sz w:val="21"/>
+          <w:szCs w:val="21"/>
         </w:rPr>
         <w:t xml:space="preserve">DURATION (what, why, how)</w:t>
       </w:r>
@@ -5392,16 +5488,16 @@
           <w:rFonts w:ascii="Calibri" w:cs="Calibri" w:eastAsia="Calibri" w:hAnsi="Calibri"/>
           <w:b/>
           <w:bCs/>
-          <w:sz w:val="22"/>
-          <w:szCs w:val="22"/>
+          <w:sz w:val="21"/>
+          <w:szCs w:val="21"/>
         </w:rPr>
         <w:t xml:space="preserve">What:</w:t>
       </w:r>
       <w:r>
         <w:rPr>
           <w:rFonts w:ascii="Calibri" w:cs="Calibri" w:eastAsia="Calibri" w:hAnsi="Calibri"/>
-          <w:sz w:val="22"/>
-          <w:szCs w:val="22"/>
+          <w:sz w:val="21"/>
+          <w:szCs w:val="21"/>
         </w:rPr>
         <w:t xml:space="preserve"> the average time (in years) until you get the bond’s cash, weighted by PV.</w:t>
       </w:r>
@@ -5415,16 +5511,16 @@
           <w:rFonts w:ascii="Calibri" w:cs="Calibri" w:eastAsia="Calibri" w:hAnsi="Calibri"/>
           <w:b/>
           <w:bCs/>
-          <w:sz w:val="22"/>
-          <w:szCs w:val="22"/>
+          <w:sz w:val="21"/>
+          <w:szCs w:val="21"/>
         </w:rPr>
         <w:t xml:space="preserve">Why:</w:t>
       </w:r>
       <w:r>
         <w:rPr>
           <w:rFonts w:ascii="Calibri" w:cs="Calibri" w:eastAsia="Calibri" w:hAnsi="Calibri"/>
-          <w:sz w:val="22"/>
-          <w:szCs w:val="22"/>
+          <w:sz w:val="21"/>
+          <w:szCs w:val="21"/>
         </w:rPr>
         <w:t xml:space="preserve"> it tells how much the price moves when yields move (interest-rate risk). Higher duration = more risk. Used to compare bonds and to match assets to liabilities.</w:t>
       </w:r>
@@ -5438,8 +5534,8 @@
           <w:rFonts w:ascii="Calibri" w:cs="Calibri" w:eastAsia="Calibri" w:hAnsi="Calibri"/>
           <w:b/>
           <w:bCs/>
-          <w:sz w:val="22"/>
-          <w:szCs w:val="22"/>
+          <w:sz w:val="21"/>
+          <w:szCs w:val="21"/>
         </w:rPr>
         <w:t xml:space="preserve">Macaulay D = Σ (t × PV of CF) / price.  Modified MD = D / (1 + y/2)</w:t>
       </w:r>
@@ -5453,16 +5549,16 @@
           <w:rFonts w:ascii="Calibri" w:cs="Calibri" w:eastAsia="Calibri" w:hAnsi="Calibri"/>
           <w:b/>
           <w:bCs/>
-          <w:sz w:val="22"/>
-          <w:szCs w:val="22"/>
+          <w:sz w:val="21"/>
+          <w:szCs w:val="21"/>
         </w:rPr>
         <w:t xml:space="preserve">% price change ≈ –MD × Δy.</w:t>
       </w:r>
       <w:r>
         <w:rPr>
           <w:rFonts w:ascii="Calibri" w:cs="Calibri" w:eastAsia="Calibri" w:hAnsi="Calibri"/>
-          <w:sz w:val="22"/>
-          <w:szCs w:val="22"/>
+          <w:sz w:val="21"/>
+          <w:szCs w:val="21"/>
         </w:rPr>
         <w:t xml:space="preserve"> MD = 7.7 and yields +1% ⇒ price ≈ –7.7%.</w:t>
       </w:r>
@@ -5474,8 +5570,8 @@
       <w:r>
         <w:rPr>
           <w:rFonts w:ascii="Calibri" w:cs="Calibri" w:eastAsia="Calibri" w:hAnsi="Calibri"/>
-          <w:sz w:val="22"/>
-          <w:szCs w:val="22"/>
+          <w:sz w:val="21"/>
+          <w:szCs w:val="21"/>
         </w:rPr>
         <w:t xml:space="preserve">From two prices: D ≈ –(% change in price) / (change in yield).</w:t>
       </w:r>
@@ -5489,16 +5585,16 @@
           <w:rFonts w:ascii="Calibri" w:cs="Calibri" w:eastAsia="Calibri" w:hAnsi="Calibri"/>
           <w:b/>
           <w:bCs/>
-          <w:sz w:val="22"/>
-          <w:szCs w:val="22"/>
+          <w:sz w:val="21"/>
+          <w:szCs w:val="21"/>
         </w:rPr>
         <w:t xml:space="preserve">By hand,</w:t>
       </w:r>
       <w:r>
         <w:rPr>
           <w:rFonts w:ascii="Calibri" w:cs="Calibri" w:eastAsia="Calibri" w:hAnsi="Calibri"/>
-          <w:sz w:val="22"/>
-          <w:szCs w:val="22"/>
+          <w:sz w:val="21"/>
+          <w:szCs w:val="21"/>
         </w:rPr>
         <w:t xml:space="preserve"> one row per coupon k = 1…N (row 2 shown):</w:t>
       </w:r>
@@ -5510,8 +5606,8 @@
       <w:r>
         <w:rPr>
           <w:rFonts w:ascii="Calibri" w:cs="Calibri" w:eastAsia="Calibri" w:hAnsi="Calibri"/>
-          <w:sz w:val="22"/>
-          <w:szCs w:val="22"/>
+          <w:sz w:val="21"/>
+          <w:szCs w:val="21"/>
         </w:rPr>
         <w:t xml:space="preserve">A: k   B: years </w:t>
       </w:r>
@@ -5521,16 +5617,16 @@
           <w:b/>
           <w:bCs/>
           <w:color w:val="1F4E79"/>
-          <w:sz w:val="22"/>
-          <w:szCs w:val="22"/>
+          <w:sz w:val="21"/>
+          <w:szCs w:val="21"/>
         </w:rPr>
         <w:t xml:space="preserve">=A2/2</w:t>
       </w:r>
       <w:r>
         <w:rPr>
           <w:rFonts w:ascii="Calibri" w:cs="Calibri" w:eastAsia="Calibri" w:hAnsi="Calibri"/>
-          <w:sz w:val="22"/>
-          <w:szCs w:val="22"/>
+          <w:sz w:val="21"/>
+          <w:szCs w:val="21"/>
         </w:rPr>
         <w:t xml:space="preserve">   C: cash </w:t>
       </w:r>
@@ -5540,16 +5636,16 @@
           <w:b/>
           <w:bCs/>
           <w:color w:val="1F4E79"/>
-          <w:sz w:val="22"/>
-          <w:szCs w:val="22"/>
+          <w:sz w:val="21"/>
+          <w:szCs w:val="21"/>
         </w:rPr>
         <w:t xml:space="preserve">=c*100/2</w:t>
       </w:r>
       <w:r>
         <w:rPr>
           <w:rFonts w:ascii="Calibri" w:cs="Calibri" w:eastAsia="Calibri" w:hAnsi="Calibri"/>
-          <w:sz w:val="22"/>
-          <w:szCs w:val="22"/>
+          <w:sz w:val="21"/>
+          <w:szCs w:val="21"/>
         </w:rPr>
         <w:t xml:space="preserve"> (+100 in last row)</w:t>
       </w:r>
@@ -5561,8 +5657,8 @@
       <w:r>
         <w:rPr>
           <w:rFonts w:ascii="Calibri" w:cs="Calibri" w:eastAsia="Calibri" w:hAnsi="Calibri"/>
-          <w:sz w:val="22"/>
-          <w:szCs w:val="22"/>
+          <w:sz w:val="21"/>
+          <w:szCs w:val="21"/>
         </w:rPr>
         <w:t xml:space="preserve">D: PV </w:t>
       </w:r>
@@ -5572,16 +5668,16 @@
           <w:b/>
           <w:bCs/>
           <w:color w:val="1F4E79"/>
-          <w:sz w:val="22"/>
-          <w:szCs w:val="22"/>
+          <w:sz w:val="21"/>
+          <w:szCs w:val="21"/>
         </w:rPr>
         <w:t xml:space="preserve">=C2/(1+y/2)^A2</w:t>
       </w:r>
       <w:r>
         <w:rPr>
           <w:rFonts w:ascii="Calibri" w:cs="Calibri" w:eastAsia="Calibri" w:hAnsi="Calibri"/>
-          <w:sz w:val="22"/>
-          <w:szCs w:val="22"/>
+          <w:sz w:val="21"/>
+          <w:szCs w:val="21"/>
         </w:rPr>
         <w:t xml:space="preserve">   E: </w:t>
       </w:r>
@@ -5591,8 +5687,8 @@
           <w:b/>
           <w:bCs/>
           <w:color w:val="1F4E79"/>
-          <w:sz w:val="22"/>
-          <w:szCs w:val="22"/>
+          <w:sz w:val="21"/>
+          <w:szCs w:val="21"/>
         </w:rPr>
         <w:t xml:space="preserve">=B2*D2</w:t>
       </w:r>
@@ -5604,8 +5700,8 @@
       <w:r>
         <w:rPr>
           <w:rFonts w:ascii="Calibri" w:cs="Calibri" w:eastAsia="Calibri" w:hAnsi="Calibri"/>
-          <w:sz w:val="22"/>
-          <w:szCs w:val="22"/>
+          <w:sz w:val="21"/>
+          <w:szCs w:val="21"/>
         </w:rPr>
         <w:t xml:space="preserve">Price = SUM(D). </w:t>
       </w:r>
@@ -5614,16 +5710,16 @@
           <w:rFonts w:ascii="Calibri" w:cs="Calibri" w:eastAsia="Calibri" w:hAnsi="Calibri"/>
           <w:b/>
           <w:bCs/>
-          <w:sz w:val="22"/>
-          <w:szCs w:val="22"/>
+          <w:sz w:val="21"/>
+          <w:szCs w:val="21"/>
         </w:rPr>
         <w:t xml:space="preserve">D = SUM(E) / SUM(D).</w:t>
       </w:r>
       <w:r>
         <w:rPr>
           <w:rFonts w:ascii="Calibri" w:cs="Calibri" w:eastAsia="Calibri" w:hAnsi="Calibri"/>
-          <w:sz w:val="22"/>
-          <w:szCs w:val="22"/>
+          <w:sz w:val="21"/>
+          <w:szCs w:val="21"/>
         </w:rPr>
         <w:t xml:space="preserve"> Between coupon dates, periods = k – 1 + COUPDAYSNC/COUPDAYS.</w:t>
       </w:r>
@@ -5637,16 +5733,16 @@
           <w:rFonts w:ascii="Calibri" w:cs="Calibri" w:eastAsia="Calibri" w:hAnsi="Calibri"/>
           <w:b/>
           <w:bCs/>
-          <w:sz w:val="22"/>
-          <w:szCs w:val="22"/>
+          <w:sz w:val="21"/>
+          <w:szCs w:val="21"/>
         </w:rPr>
         <w:t xml:space="preserve">No dates given?</w:t>
       </w:r>
       <w:r>
         <w:rPr>
           <w:rFonts w:ascii="Calibri" w:cs="Calibri" w:eastAsia="Calibri" w:hAnsi="Calibri"/>
-          <w:sz w:val="22"/>
-          <w:szCs w:val="22"/>
+          <w:sz w:val="21"/>
+          <w:szCs w:val="21"/>
         </w:rPr>
         <w:t xml:space="preserve"> </w:t>
       </w:r>
@@ -5656,8 +5752,8 @@
           <w:b/>
           <w:bCs/>
           <w:color w:val="1F4E79"/>
-          <w:sz w:val="22"/>
-          <w:szCs w:val="22"/>
+          <w:sz w:val="21"/>
+          <w:szCs w:val="21"/>
         </w:rPr>
         <w:t xml:space="preserve">=DURATION(DATE(2000,1,1),DATE(2000+years,1,1),c,y,2)</w:t>
       </w:r>
@@ -5669,8 +5765,8 @@
       <w:r>
         <w:rPr>
           <w:rFonts w:ascii="Calibri" w:cs="Calibri" w:eastAsia="Calibri" w:hAnsi="Calibri"/>
-          <w:sz w:val="22"/>
-          <w:szCs w:val="22"/>
+          <w:sz w:val="21"/>
+          <w:szCs w:val="21"/>
         </w:rPr>
         <w:t xml:space="preserve">Zero-coupon D = maturity. Longer maturity ⇒ higher D. Higher coupon ⇒ lower D.</w:t>
       </w:r>
@@ -5684,16 +5780,16 @@
           <w:rFonts w:ascii="Calibri" w:cs="Calibri" w:eastAsia="Calibri" w:hAnsi="Calibri"/>
           <w:b/>
           <w:bCs/>
-          <w:sz w:val="22"/>
-          <w:szCs w:val="22"/>
+          <w:sz w:val="21"/>
+          <w:szCs w:val="21"/>
         </w:rPr>
         <w:t xml:space="preserve">Convexity:</w:t>
       </w:r>
       <w:r>
         <w:rPr>
           <w:rFonts w:ascii="Calibri" w:cs="Calibri" w:eastAsia="Calibri" w:hAnsi="Calibri"/>
-          <w:sz w:val="22"/>
-          <w:szCs w:val="22"/>
+          <w:sz w:val="21"/>
+          <w:szCs w:val="21"/>
         </w:rPr>
         <w:t xml:space="preserve"> the real price change beats the estimate (falls less, rises more).</w:t>
       </w:r>
@@ -5710,8 +5806,8 @@
           <w:b/>
           <w:bCs/>
           <w:color w:val="FFFFFF"/>
-          <w:sz w:val="22"/>
-          <w:szCs w:val="22"/>
+          <w:sz w:val="21"/>
+          <w:szCs w:val="21"/>
         </w:rPr>
         <w:t xml:space="preserve">WORKED EXAMPLES (check your syntax)</w:t>
       </w:r>
@@ -5725,16 +5821,16 @@
           <w:rFonts w:ascii="Calibri" w:cs="Calibri" w:eastAsia="Calibri" w:hAnsi="Calibri"/>
           <w:b/>
           <w:bCs/>
-          <w:sz w:val="22"/>
-          <w:szCs w:val="22"/>
+          <w:sz w:val="21"/>
+          <w:szCs w:val="21"/>
         </w:rPr>
         <w:t xml:space="preserve">Contracts, r = 10%:</w:t>
       </w:r>
       <w:r>
         <w:rPr>
           <w:rFonts w:ascii="Calibri" w:cs="Calibri" w:eastAsia="Calibri" w:hAnsi="Calibri"/>
-          <w:sz w:val="22"/>
-          <w:szCs w:val="22"/>
+          <w:sz w:val="21"/>
+          <w:szCs w:val="21"/>
         </w:rPr>
         <w:t xml:space="preserve"> 30/yr × 10 yrs: </w:t>
       </w:r>
@@ -5744,16 +5840,16 @@
           <w:b/>
           <w:bCs/>
           <w:color w:val="1F4E79"/>
-          <w:sz w:val="22"/>
-          <w:szCs w:val="22"/>
+          <w:sz w:val="21"/>
+          <w:szCs w:val="21"/>
         </w:rPr>
         <w:t xml:space="preserve">=PV(0.1,10,-30)</w:t>
       </w:r>
       <w:r>
         <w:rPr>
           <w:rFonts w:ascii="Calibri" w:cs="Calibri" w:eastAsia="Calibri" w:hAnsi="Calibri"/>
-          <w:sz w:val="22"/>
-          <w:szCs w:val="22"/>
+          <w:sz w:val="21"/>
+          <w:szCs w:val="21"/>
         </w:rPr>
         <w:t xml:space="preserve"> = 184.34. 35/yr × 8 yrs: </w:t>
       </w:r>
@@ -5763,16 +5859,16 @@
           <w:b/>
           <w:bCs/>
           <w:color w:val="1F4E79"/>
-          <w:sz w:val="22"/>
-          <w:szCs w:val="22"/>
+          <w:sz w:val="21"/>
+          <w:szCs w:val="21"/>
         </w:rPr>
         <w:t xml:space="preserve">=PV(0.1,8,-35)</w:t>
       </w:r>
       <w:r>
         <w:rPr>
           <w:rFonts w:ascii="Calibri" w:cs="Calibri" w:eastAsia="Calibri" w:hAnsi="Calibri"/>
-          <w:sz w:val="22"/>
-          <w:szCs w:val="22"/>
+          <w:sz w:val="21"/>
+          <w:szCs w:val="21"/>
         </w:rPr>
         <w:t xml:space="preserve"> = 186.72, so pick #2. Value at year 10: </w:t>
       </w:r>
@@ -5782,16 +5878,16 @@
           <w:b/>
           <w:bCs/>
           <w:color w:val="1F4E79"/>
-          <w:sz w:val="22"/>
-          <w:szCs w:val="22"/>
+          <w:sz w:val="21"/>
+          <w:szCs w:val="21"/>
         </w:rPr>
         <w:t xml:space="preserve">=FV(0.1,10,-30)</w:t>
       </w:r>
       <w:r>
         <w:rPr>
           <w:rFonts w:ascii="Calibri" w:cs="Calibri" w:eastAsia="Calibri" w:hAnsi="Calibri"/>
-          <w:sz w:val="22"/>
-          <w:szCs w:val="22"/>
+          <w:sz w:val="21"/>
+          <w:szCs w:val="21"/>
         </w:rPr>
         <w:t xml:space="preserve"> = 478.12; </w:t>
       </w:r>
@@ -5801,16 +5897,16 @@
           <w:b/>
           <w:bCs/>
           <w:color w:val="1F4E79"/>
-          <w:sz w:val="22"/>
-          <w:szCs w:val="22"/>
+          <w:sz w:val="21"/>
+          <w:szCs w:val="21"/>
         </w:rPr>
         <w:t xml:space="preserve">=FV(0.1,8,-35)*1.1^2</w:t>
       </w:r>
       <w:r>
         <w:rPr>
           <w:rFonts w:ascii="Calibri" w:cs="Calibri" w:eastAsia="Calibri" w:hAnsi="Calibri"/>
-          <w:sz w:val="22"/>
-          <w:szCs w:val="22"/>
+          <w:sz w:val="21"/>
+          <w:szCs w:val="21"/>
         </w:rPr>
         <w:t xml:space="preserve"> = 484.31.</w:t>
       </w:r>
@@ -5824,16 +5920,16 @@
           <w:rFonts w:ascii="Calibri" w:cs="Calibri" w:eastAsia="Calibri" w:hAnsi="Calibri"/>
           <w:b/>
           <w:bCs/>
-          <w:sz w:val="22"/>
-          <w:szCs w:val="22"/>
+          <w:sz w:val="21"/>
+          <w:szCs w:val="21"/>
         </w:rPr>
         <w:t xml:space="preserve">Ma Corp bond:</w:t>
       </w:r>
       <w:r>
         <w:rPr>
           <w:rFonts w:ascii="Calibri" w:cs="Calibri" w:eastAsia="Calibri" w:hAnsi="Calibri"/>
-          <w:sz w:val="22"/>
-          <w:szCs w:val="22"/>
+          <w:sz w:val="21"/>
+          <w:szCs w:val="21"/>
         </w:rPr>
         <w:t xml:space="preserve"> </w:t>
       </w:r>
@@ -5843,16 +5939,16 @@
           <w:b/>
           <w:bCs/>
           <w:color w:val="1F4E79"/>
-          <w:sz w:val="22"/>
-          <w:szCs w:val="22"/>
+          <w:sz w:val="21"/>
+          <w:szCs w:val="21"/>
         </w:rPr>
         <w:t xml:space="preserve">=PRICE(DATE(2024,10,17),DATE(2054,5,15),0.1,0.12,100,2,0)</w:t>
       </w:r>
       <w:r>
         <w:rPr>
           <w:rFonts w:ascii="Calibri" w:cs="Calibri" w:eastAsia="Calibri" w:hAnsi="Calibri"/>
-          <w:sz w:val="22"/>
-          <w:szCs w:val="22"/>
+          <w:sz w:val="21"/>
+          <w:szCs w:val="21"/>
         </w:rPr>
         <w:t xml:space="preserve"> = 83.845 clean. COUPDAYBS = 152, COUPDAYS = 180, accrued = 5 × 152/180 = 4.222, dirty = 88.067. MDURATION = 7.804; +25 bp ⇒ ≈ –7.804 × 0.0025 = –1.95%.</w:t>
       </w:r>
@@ -6074,6 +6170,12 @@
       <w:startOverride w:val="1"/>
     </w:lvlOverride>
   </w:num>
+  <w:num w:numId="4">
+    <w:abstractNumId w:val="3"/>
+    <w:lvlOverride w:ilvl="0">
+      <w:startOverride w:val="1"/>
+    </w:lvlOverride>
+  </w:num>
 </w:numbering>
 </file>
 
@@ -6083,8 +6185,8 @@
     <w:rPrDefault>
       <w:rPr>
         <w:rFonts w:ascii="Calibri" w:cs="Calibri" w:eastAsia="Calibri" w:hAnsi="Calibri"/>
-        <w:sz w:val="22"/>
-        <w:szCs w:val="22"/>
+        <w:sz w:val="21"/>
+        <w:szCs w:val="21"/>
       </w:rPr>
     </w:rPrDefault>
     <w:pPrDefault/>

</xml_diff>

<commit_message>
Notes sheet: add market value of outstanding bonds
Co-Authored-By: Claude Opus 5.5 <noreply@anthropic.com>
Claude-Session: https://claude.ai/code/session_01GEFnz4bwrCJKQo1pbVjL4k
</commit_message>
<xml_diff>
--- a/ec1745-midterm-prep/EC1745_Notes_Sheet.docx
+++ b/ec1745-midterm-prep/EC1745_Notes_Sheet.docx
@@ -5051,6 +5051,29 @@
           <w:szCs w:val="21"/>
         </w:rPr>
         <w:t xml:space="preserve"> the new bond must be worth what the old one is worth. Solve for the new coupon with PMT. Face needed to raise $X = X / (price/100).</w:t>
+      </w:r>
+    </w:p>
+    <w:p>
+      <w:pPr>
+        <w:spacing w:after="0" w:before="0"/>
+      </w:pPr>
+      <w:r>
+        <w:rPr>
+          <w:rFonts w:ascii="Calibri" w:cs="Calibri" w:eastAsia="Calibri" w:hAnsi="Calibri"/>
+          <w:b/>
+          <w:bCs/>
+          <w:sz w:val="21"/>
+          <w:szCs w:val="21"/>
+        </w:rPr>
+        <w:t xml:space="preserve">Market value of all bonds</w:t>
+      </w:r>
+      <w:r>
+        <w:rPr>
+          <w:rFonts w:ascii="Calibri" w:cs="Calibri" w:eastAsia="Calibri" w:hAnsi="Calibri"/>
+          <w:sz w:val="21"/>
+          <w:szCs w:val="21"/>
+        </w:rPr>
+        <w:t xml:space="preserve"> = face outstanding × price / 100. Example: 400 × 87.91 / 100 = 351.62.</w:t>
       </w:r>
     </w:p>
     <w:p>

</xml_diff>